<commit_message>
Modificacion de la documentacion
</commit_message>
<xml_diff>
--- a/SimuTrade/app/sampledata/Memoria_SimuTrade.docx
+++ b/SimuTrade/app/sampledata/Memoria_SimuTrade.docx
@@ -187,6 +187,11 @@
       <w:pPr>
         <w:spacing w:before="120" w:after="120"/>
         <w:jc w:val="center"/>
+        <w:rPr>
+          <w:color w:val="475569"/>
+          <w:sz w:val="22"/>
+          <w:szCs w:val="22"/>
+        </w:rPr>
       </w:pPr>
       <w:r>
         <w:rPr>
@@ -198,6 +203,20 @@
       </w:r>
     </w:p>
     <w:p>
+      <w:pPr>
+        <w:spacing w:before="120" w:after="120"/>
+        <w:jc w:val="center"/>
+      </w:pPr>
+      <w:r>
+        <w:rPr>
+          <w:color w:val="475569"/>
+          <w:sz w:val="22"/>
+          <w:szCs w:val="22"/>
+        </w:rPr>
+        <w:t>Fecha presentación: 27/05/2026</w:t>
+      </w:r>
+    </w:p>
+    <w:p>
       <w:r>
         <w:br w:type="page"/>
       </w:r>
@@ -216,7 +235,7 @@
       <w:pPr>
         <w:pStyle w:val="Ttulo1"/>
       </w:pPr>
-      <w:bookmarkStart w:id="0" w:name="_Toc229072228"/>
+      <w:bookmarkStart w:id="0" w:name="_Toc229165954"/>
       <w:r>
         <w:lastRenderedPageBreak/>
         <w:t>Agradecimientos</w:t>
@@ -230,7 +249,15 @@
         <w:jc w:val="both"/>
       </w:pPr>
       <w:r>
-        <w:t>Los autores desean expresar su agradecimiento a la tutora Ruth Lospitao Ruiz por su orientación y apoyo durante el desarrollo de este proyecto. Asimismo, se agradece a todos los compañeros del ciclo que han participado en las pruebas de la aplicación y han aportado sugerencias de mejora.</w:t>
+        <w:t xml:space="preserve">Los autores desean expresar su agradecimiento a la tutora Ruth </w:t>
+      </w:r>
+      <w:proofErr w:type="spellStart"/>
+      <w:r>
+        <w:t>Lospitao</w:t>
+      </w:r>
+      <w:proofErr w:type="spellEnd"/>
+      <w:r>
+        <w:t xml:space="preserve"> Ruiz por su orientación y apoyo durante el desarrollo de este proyecto. Asimismo, agradecen a todos los compañeros y profesores del ciclo los conocimientos, consejos y ayuda aportados, que han sido fundamentales para la realización de este trabajo y para llegar hasta este punto.</w:t>
       </w:r>
     </w:p>
     <w:p>
@@ -242,7 +269,7 @@
       <w:pPr>
         <w:pStyle w:val="Ttulo1"/>
       </w:pPr>
-      <w:bookmarkStart w:id="1" w:name="_Toc229072229"/>
+      <w:bookmarkStart w:id="1" w:name="_Toc229165955"/>
       <w:r>
         <w:lastRenderedPageBreak/>
         <w:t>Resumen</w:t>
@@ -416,13 +443,25 @@
       </w:r>
       <w:proofErr w:type="spellEnd"/>
       <w:r>
-        <w:t>, inversión, gamificación, MVVM.</w:t>
-      </w:r>
-    </w:p>
-    <w:p>
-      <w:pPr>
-        <w:spacing w:after="480"/>
-      </w:pPr>
+        <w:t>, inversión</w:t>
+      </w:r>
+      <w:r>
+        <w:t xml:space="preserve"> educativa</w:t>
+      </w:r>
+      <w:r>
+        <w:t>,</w:t>
+      </w:r>
+      <w:r>
+        <w:t xml:space="preserve"> </w:t>
+      </w:r>
+      <w:r>
+        <w:t>MVVM.</w:t>
+      </w:r>
+    </w:p>
+    <w:p>
+      <w:r>
+        <w:br w:type="page"/>
+      </w:r>
     </w:p>
     <w:p>
       <w:pPr>
@@ -431,11 +470,12 @@
           <w:lang w:val="en-GB"/>
         </w:rPr>
       </w:pPr>
-      <w:bookmarkStart w:id="2" w:name="_Toc229072230"/>
+      <w:bookmarkStart w:id="2" w:name="_Toc229165956"/>
       <w:r>
         <w:rPr>
           <w:lang w:val="en-GB"/>
         </w:rPr>
+        <w:lastRenderedPageBreak/>
         <w:t>Abstract</w:t>
       </w:r>
       <w:bookmarkEnd w:id="2"/>
@@ -469,7 +509,6 @@
         <w:rPr>
           <w:lang w:val="en-GB"/>
         </w:rPr>
-        <w:lastRenderedPageBreak/>
         <w:t xml:space="preserve">The user starts with a virtual balance of 100 euros and can buy and sell shares from companies such as Apple, Microsoft or Tesla, as well as cryptocurrencies such as Bitcoin or Ethereum, with prices obtained in real time from the </w:t>
       </w:r>
       <w:proofErr w:type="spellStart"/>
@@ -558,7 +597,7 @@
         <w:rPr>
           <w:lang w:val="en-GB"/>
         </w:rPr>
-        <w:t>Android, Kotlin, Jetpack Compose, Firebase, investment, gamification, MVVM.</w:t>
+        <w:t>Android, Kotlin, Jetpack Compose, Firebase, investment, MVVM.</w:t>
       </w:r>
     </w:p>
     <w:p>
@@ -578,7 +617,7 @@
       <w:pPr>
         <w:pStyle w:val="Ttulo1"/>
       </w:pPr>
-      <w:bookmarkStart w:id="3" w:name="_Toc229072231"/>
+      <w:bookmarkStart w:id="3" w:name="_Toc229165957"/>
       <w:r>
         <w:lastRenderedPageBreak/>
         <w:t>Índice General</w:t>
@@ -598,7 +637,10 @@
               <w:tab w:val="right" w:leader="dot" w:pos="8494"/>
             </w:tabs>
             <w:rPr>
+              <w:rFonts w:asciiTheme="minorHAnsi" w:eastAsiaTheme="minorEastAsia" w:hAnsiTheme="minorHAnsi" w:cstheme="minorBidi"/>
               <w:noProof/>
+              <w:kern w:val="2"/>
+              <w14:ligatures w14:val="standardContextual"/>
             </w:rPr>
           </w:pPr>
           <w:r>
@@ -610,7 +652,7 @@
           <w:r>
             <w:fldChar w:fldCharType="separate"/>
           </w:r>
-          <w:hyperlink w:anchor="_Toc229072228" w:history="1">
+          <w:hyperlink w:anchor="_Toc229165954" w:history="1">
             <w:r>
               <w:rPr>
                 <w:rStyle w:val="Hipervnculo"/>
@@ -634,7 +676,7 @@
               <w:rPr>
                 <w:noProof/>
               </w:rPr>
-              <w:instrText xml:space="preserve"> PAGEREF _Toc229072228 \h </w:instrText>
+              <w:instrText xml:space="preserve"> PAGEREF _Toc229165954 \h </w:instrText>
             </w:r>
             <w:r>
               <w:rPr>
@@ -651,7 +693,7 @@
               <w:rPr>
                 <w:noProof/>
               </w:rPr>
-              <w:t>1</w:t>
+              <w:t>2</w:t>
             </w:r>
             <w:r>
               <w:rPr>
@@ -668,10 +710,13 @@
               <w:tab w:val="right" w:leader="dot" w:pos="8494"/>
             </w:tabs>
             <w:rPr>
+              <w:rFonts w:asciiTheme="minorHAnsi" w:eastAsiaTheme="minorEastAsia" w:hAnsiTheme="minorHAnsi" w:cstheme="minorBidi"/>
               <w:noProof/>
+              <w:kern w:val="2"/>
+              <w14:ligatures w14:val="standardContextual"/>
             </w:rPr>
           </w:pPr>
-          <w:hyperlink w:anchor="_Toc229072229" w:history="1">
+          <w:hyperlink w:anchor="_Toc229165955" w:history="1">
             <w:r>
               <w:rPr>
                 <w:rStyle w:val="Hipervnculo"/>
@@ -695,7 +740,7 @@
               <w:rPr>
                 <w:noProof/>
               </w:rPr>
-              <w:instrText xml:space="preserve"> PAGEREF _Toc229072229 \h </w:instrText>
+              <w:instrText xml:space="preserve"> PAGEREF _Toc229165955 \h </w:instrText>
             </w:r>
             <w:r>
               <w:rPr>
@@ -712,7 +757,7 @@
               <w:rPr>
                 <w:noProof/>
               </w:rPr>
-              <w:t>1</w:t>
+              <w:t>3</w:t>
             </w:r>
             <w:r>
               <w:rPr>
@@ -729,14 +774,18 @@
               <w:tab w:val="right" w:leader="dot" w:pos="8494"/>
             </w:tabs>
             <w:rPr>
+              <w:rFonts w:asciiTheme="minorHAnsi" w:eastAsiaTheme="minorEastAsia" w:hAnsiTheme="minorHAnsi" w:cstheme="minorBidi"/>
               <w:noProof/>
+              <w:kern w:val="2"/>
+              <w14:ligatures w14:val="standardContextual"/>
             </w:rPr>
           </w:pPr>
-          <w:hyperlink w:anchor="_Toc229072230" w:history="1">
+          <w:hyperlink w:anchor="_Toc229165956" w:history="1">
             <w:r>
               <w:rPr>
                 <w:rStyle w:val="Hipervnculo"/>
                 <w:noProof/>
+                <w:lang w:val="en-GB"/>
               </w:rPr>
               <w:t>Abstract</w:t>
             </w:r>
@@ -756,7 +805,7 @@
               <w:rPr>
                 <w:noProof/>
               </w:rPr>
-              <w:instrText xml:space="preserve"> PAGEREF _Toc229072230 \h </w:instrText>
+              <w:instrText xml:space="preserve"> PAGEREF _Toc229165956 \h </w:instrText>
             </w:r>
             <w:r>
               <w:rPr>
@@ -773,7 +822,7 @@
               <w:rPr>
                 <w:noProof/>
               </w:rPr>
-              <w:t>1</w:t>
+              <w:t>4</w:t>
             </w:r>
             <w:r>
               <w:rPr>
@@ -790,10 +839,13 @@
               <w:tab w:val="right" w:leader="dot" w:pos="8494"/>
             </w:tabs>
             <w:rPr>
+              <w:rFonts w:asciiTheme="minorHAnsi" w:eastAsiaTheme="minorEastAsia" w:hAnsiTheme="minorHAnsi" w:cstheme="minorBidi"/>
               <w:noProof/>
+              <w:kern w:val="2"/>
+              <w14:ligatures w14:val="standardContextual"/>
             </w:rPr>
           </w:pPr>
-          <w:hyperlink w:anchor="_Toc229072231" w:history="1">
+          <w:hyperlink w:anchor="_Toc229165957" w:history="1">
             <w:r>
               <w:rPr>
                 <w:rStyle w:val="Hipervnculo"/>
@@ -817,7 +869,7 @@
               <w:rPr>
                 <w:noProof/>
               </w:rPr>
-              <w:instrText xml:space="preserve"> PAGEREF _Toc229072231 \h </w:instrText>
+              <w:instrText xml:space="preserve"> PAGEREF _Toc229165957 \h </w:instrText>
             </w:r>
             <w:r>
               <w:rPr>
@@ -834,7 +886,7 @@
               <w:rPr>
                 <w:noProof/>
               </w:rPr>
-              <w:t>1</w:t>
+              <w:t>5</w:t>
             </w:r>
             <w:r>
               <w:rPr>
@@ -851,10 +903,13 @@
               <w:tab w:val="right" w:leader="dot" w:pos="8494"/>
             </w:tabs>
             <w:rPr>
+              <w:rFonts w:asciiTheme="minorHAnsi" w:eastAsiaTheme="minorEastAsia" w:hAnsiTheme="minorHAnsi" w:cstheme="minorBidi"/>
               <w:noProof/>
+              <w:kern w:val="2"/>
+              <w14:ligatures w14:val="standardContextual"/>
             </w:rPr>
           </w:pPr>
-          <w:hyperlink w:anchor="_Toc229072232" w:history="1">
+          <w:hyperlink w:anchor="_Toc229165958" w:history="1">
             <w:r>
               <w:rPr>
                 <w:rStyle w:val="Hipervnculo"/>
@@ -878,7 +933,7 @@
               <w:rPr>
                 <w:noProof/>
               </w:rPr>
-              <w:instrText xml:space="preserve"> PAGEREF _Toc229072232 \h </w:instrText>
+              <w:instrText xml:space="preserve"> PAGEREF _Toc229165958 \h </w:instrText>
             </w:r>
             <w:r>
               <w:rPr>
@@ -895,7 +950,7 @@
               <w:rPr>
                 <w:noProof/>
               </w:rPr>
-              <w:t>1</w:t>
+              <w:t>7</w:t>
             </w:r>
             <w:r>
               <w:rPr>
@@ -912,10 +967,13 @@
               <w:tab w:val="right" w:leader="dot" w:pos="8494"/>
             </w:tabs>
             <w:rPr>
+              <w:rFonts w:asciiTheme="minorHAnsi" w:eastAsiaTheme="minorEastAsia" w:hAnsiTheme="minorHAnsi" w:cstheme="minorBidi"/>
               <w:noProof/>
+              <w:kern w:val="2"/>
+              <w14:ligatures w14:val="standardContextual"/>
             </w:rPr>
           </w:pPr>
-          <w:hyperlink w:anchor="_Toc229072233" w:history="1">
+          <w:hyperlink w:anchor="_Toc229165959" w:history="1">
             <w:r>
               <w:rPr>
                 <w:rStyle w:val="Hipervnculo"/>
@@ -939,7 +997,7 @@
               <w:rPr>
                 <w:noProof/>
               </w:rPr>
-              <w:instrText xml:space="preserve"> PAGEREF _Toc229072233 \h </w:instrText>
+              <w:instrText xml:space="preserve"> PAGEREF _Toc229165959 \h </w:instrText>
             </w:r>
             <w:r>
               <w:rPr>
@@ -956,7 +1014,7 @@
               <w:rPr>
                 <w:noProof/>
               </w:rPr>
-              <w:t>1</w:t>
+              <w:t>7</w:t>
             </w:r>
             <w:r>
               <w:rPr>
@@ -973,10 +1031,13 @@
               <w:tab w:val="right" w:leader="dot" w:pos="8494"/>
             </w:tabs>
             <w:rPr>
+              <w:rFonts w:asciiTheme="minorHAnsi" w:eastAsiaTheme="minorEastAsia" w:hAnsiTheme="minorHAnsi" w:cstheme="minorBidi"/>
               <w:noProof/>
+              <w:kern w:val="2"/>
+              <w14:ligatures w14:val="standardContextual"/>
             </w:rPr>
           </w:pPr>
-          <w:hyperlink w:anchor="_Toc229072234" w:history="1">
+          <w:hyperlink w:anchor="_Toc229165960" w:history="1">
             <w:r>
               <w:rPr>
                 <w:rStyle w:val="Hipervnculo"/>
@@ -1000,7 +1061,7 @@
               <w:rPr>
                 <w:noProof/>
               </w:rPr>
-              <w:instrText xml:space="preserve"> PAGEREF _Toc229072234 \h </w:instrText>
+              <w:instrText xml:space="preserve"> PAGEREF _Toc229165960 \h </w:instrText>
             </w:r>
             <w:r>
               <w:rPr>
@@ -1017,7 +1078,7 @@
               <w:rPr>
                 <w:noProof/>
               </w:rPr>
-              <w:t>1</w:t>
+              <w:t>7</w:t>
             </w:r>
             <w:r>
               <w:rPr>
@@ -1034,10 +1095,13 @@
               <w:tab w:val="right" w:leader="dot" w:pos="8494"/>
             </w:tabs>
             <w:rPr>
+              <w:rFonts w:asciiTheme="minorHAnsi" w:eastAsiaTheme="minorEastAsia" w:hAnsiTheme="minorHAnsi" w:cstheme="minorBidi"/>
               <w:noProof/>
+              <w:kern w:val="2"/>
+              <w14:ligatures w14:val="standardContextual"/>
             </w:rPr>
           </w:pPr>
-          <w:hyperlink w:anchor="_Toc229072235" w:history="1">
+          <w:hyperlink w:anchor="_Toc229165961" w:history="1">
             <w:r>
               <w:rPr>
                 <w:rStyle w:val="Hipervnculo"/>
@@ -1061,7 +1125,7 @@
               <w:rPr>
                 <w:noProof/>
               </w:rPr>
-              <w:instrText xml:space="preserve"> PAGEREF _Toc229072235 \h </w:instrText>
+              <w:instrText xml:space="preserve"> PAGEREF _Toc229165961 \h </w:instrText>
             </w:r>
             <w:r>
               <w:rPr>
@@ -1078,7 +1142,7 @@
               <w:rPr>
                 <w:noProof/>
               </w:rPr>
-              <w:t>1</w:t>
+              <w:t>8</w:t>
             </w:r>
             <w:r>
               <w:rPr>
@@ -1095,10 +1159,13 @@
               <w:tab w:val="right" w:leader="dot" w:pos="8494"/>
             </w:tabs>
             <w:rPr>
+              <w:rFonts w:asciiTheme="minorHAnsi" w:eastAsiaTheme="minorEastAsia" w:hAnsiTheme="minorHAnsi" w:cstheme="minorBidi"/>
               <w:noProof/>
+              <w:kern w:val="2"/>
+              <w14:ligatures w14:val="standardContextual"/>
             </w:rPr>
           </w:pPr>
-          <w:hyperlink w:anchor="_Toc229072236" w:history="1">
+          <w:hyperlink w:anchor="_Toc229165962" w:history="1">
             <w:r>
               <w:rPr>
                 <w:rStyle w:val="Hipervnculo"/>
@@ -1122,7 +1189,7 @@
               <w:rPr>
                 <w:noProof/>
               </w:rPr>
-              <w:instrText xml:space="preserve"> PAGEREF _Toc229072236 \h </w:instrText>
+              <w:instrText xml:space="preserve"> PAGEREF _Toc229165962 \h </w:instrText>
             </w:r>
             <w:r>
               <w:rPr>
@@ -1139,7 +1206,7 @@
               <w:rPr>
                 <w:noProof/>
               </w:rPr>
-              <w:t>1</w:t>
+              <w:t>8</w:t>
             </w:r>
             <w:r>
               <w:rPr>
@@ -1156,10 +1223,13 @@
               <w:tab w:val="right" w:leader="dot" w:pos="8494"/>
             </w:tabs>
             <w:rPr>
+              <w:rFonts w:asciiTheme="minorHAnsi" w:eastAsiaTheme="minorEastAsia" w:hAnsiTheme="minorHAnsi" w:cstheme="minorBidi"/>
               <w:noProof/>
+              <w:kern w:val="2"/>
+              <w14:ligatures w14:val="standardContextual"/>
             </w:rPr>
           </w:pPr>
-          <w:hyperlink w:anchor="_Toc229072237" w:history="1">
+          <w:hyperlink w:anchor="_Toc229165963" w:history="1">
             <w:r>
               <w:rPr>
                 <w:rStyle w:val="Hipervnculo"/>
@@ -1183,7 +1253,7 @@
               <w:rPr>
                 <w:noProof/>
               </w:rPr>
-              <w:instrText xml:space="preserve"> PAGEREF _Toc229072237 \h </w:instrText>
+              <w:instrText xml:space="preserve"> PAGEREF _Toc229165963 \h </w:instrText>
             </w:r>
             <w:r>
               <w:rPr>
@@ -1200,7 +1270,7 @@
               <w:rPr>
                 <w:noProof/>
               </w:rPr>
-              <w:t>1</w:t>
+              <w:t>8</w:t>
             </w:r>
             <w:r>
               <w:rPr>
@@ -1217,10 +1287,13 @@
               <w:tab w:val="right" w:leader="dot" w:pos="8494"/>
             </w:tabs>
             <w:rPr>
+              <w:rFonts w:asciiTheme="minorHAnsi" w:eastAsiaTheme="minorEastAsia" w:hAnsiTheme="minorHAnsi" w:cstheme="minorBidi"/>
               <w:noProof/>
+              <w:kern w:val="2"/>
+              <w14:ligatures w14:val="standardContextual"/>
             </w:rPr>
           </w:pPr>
-          <w:hyperlink w:anchor="_Toc229072238" w:history="1">
+          <w:hyperlink w:anchor="_Toc229165964" w:history="1">
             <w:r>
               <w:rPr>
                 <w:rStyle w:val="Hipervnculo"/>
@@ -1244,7 +1317,7 @@
               <w:rPr>
                 <w:noProof/>
               </w:rPr>
-              <w:instrText xml:space="preserve"> PAGEREF _Toc229072238 \h </w:instrText>
+              <w:instrText xml:space="preserve"> PAGEREF _Toc229165964 \h </w:instrText>
             </w:r>
             <w:r>
               <w:rPr>
@@ -1261,7 +1334,7 @@
               <w:rPr>
                 <w:noProof/>
               </w:rPr>
-              <w:t>1</w:t>
+              <w:t>10</w:t>
             </w:r>
             <w:r>
               <w:rPr>
@@ -1278,10 +1351,13 @@
               <w:tab w:val="right" w:leader="dot" w:pos="8494"/>
             </w:tabs>
             <w:rPr>
+              <w:rFonts w:asciiTheme="minorHAnsi" w:eastAsiaTheme="minorEastAsia" w:hAnsiTheme="minorHAnsi" w:cstheme="minorBidi"/>
               <w:noProof/>
+              <w:kern w:val="2"/>
+              <w14:ligatures w14:val="standardContextual"/>
             </w:rPr>
           </w:pPr>
-          <w:hyperlink w:anchor="_Toc229072239" w:history="1">
+          <w:hyperlink w:anchor="_Toc229165965" w:history="1">
             <w:r>
               <w:rPr>
                 <w:rStyle w:val="Hipervnculo"/>
@@ -1305,7 +1381,7 @@
               <w:rPr>
                 <w:noProof/>
               </w:rPr>
-              <w:instrText xml:space="preserve"> PAGEREF _Toc229072239 \h </w:instrText>
+              <w:instrText xml:space="preserve"> PAGEREF _Toc229165965 \h </w:instrText>
             </w:r>
             <w:r>
               <w:rPr>
@@ -1322,7 +1398,7 @@
               <w:rPr>
                 <w:noProof/>
               </w:rPr>
-              <w:t>1</w:t>
+              <w:t>10</w:t>
             </w:r>
             <w:r>
               <w:rPr>
@@ -1339,10 +1415,13 @@
               <w:tab w:val="right" w:leader="dot" w:pos="8494"/>
             </w:tabs>
             <w:rPr>
+              <w:rFonts w:asciiTheme="minorHAnsi" w:eastAsiaTheme="minorEastAsia" w:hAnsiTheme="minorHAnsi" w:cstheme="minorBidi"/>
               <w:noProof/>
+              <w:kern w:val="2"/>
+              <w14:ligatures w14:val="standardContextual"/>
             </w:rPr>
           </w:pPr>
-          <w:hyperlink w:anchor="_Toc229072240" w:history="1">
+          <w:hyperlink w:anchor="_Toc229165966" w:history="1">
             <w:r>
               <w:rPr>
                 <w:rStyle w:val="Hipervnculo"/>
@@ -1366,7 +1445,7 @@
               <w:rPr>
                 <w:noProof/>
               </w:rPr>
-              <w:instrText xml:space="preserve"> PAGEREF _Toc229072240 \h </w:instrText>
+              <w:instrText xml:space="preserve"> PAGEREF _Toc229165966 \h </w:instrText>
             </w:r>
             <w:r>
               <w:rPr>
@@ -1383,7 +1462,7 @@
               <w:rPr>
                 <w:noProof/>
               </w:rPr>
-              <w:t>1</w:t>
+              <w:t>10</w:t>
             </w:r>
             <w:r>
               <w:rPr>
@@ -1400,10 +1479,13 @@
               <w:tab w:val="right" w:leader="dot" w:pos="8494"/>
             </w:tabs>
             <w:rPr>
+              <w:rFonts w:asciiTheme="minorHAnsi" w:eastAsiaTheme="minorEastAsia" w:hAnsiTheme="minorHAnsi" w:cstheme="minorBidi"/>
               <w:noProof/>
+              <w:kern w:val="2"/>
+              <w14:ligatures w14:val="standardContextual"/>
             </w:rPr>
           </w:pPr>
-          <w:hyperlink w:anchor="_Toc229072241" w:history="1">
+          <w:hyperlink w:anchor="_Toc229165967" w:history="1">
             <w:r>
               <w:rPr>
                 <w:rStyle w:val="Hipervnculo"/>
@@ -1427,7 +1509,7 @@
               <w:rPr>
                 <w:noProof/>
               </w:rPr>
-              <w:instrText xml:space="preserve"> PAGEREF _Toc229072241 \h </w:instrText>
+              <w:instrText xml:space="preserve"> PAGEREF _Toc229165967 \h </w:instrText>
             </w:r>
             <w:r>
               <w:rPr>
@@ -1444,7 +1526,7 @@
               <w:rPr>
                 <w:noProof/>
               </w:rPr>
-              <w:t>1</w:t>
+              <w:t>11</w:t>
             </w:r>
             <w:r>
               <w:rPr>
@@ -1461,10 +1543,13 @@
               <w:tab w:val="right" w:leader="dot" w:pos="8494"/>
             </w:tabs>
             <w:rPr>
+              <w:rFonts w:asciiTheme="minorHAnsi" w:eastAsiaTheme="minorEastAsia" w:hAnsiTheme="minorHAnsi" w:cstheme="minorBidi"/>
               <w:noProof/>
+              <w:kern w:val="2"/>
+              <w14:ligatures w14:val="standardContextual"/>
             </w:rPr>
           </w:pPr>
-          <w:hyperlink w:anchor="_Toc229072242" w:history="1">
+          <w:hyperlink w:anchor="_Toc229165968" w:history="1">
             <w:r>
               <w:rPr>
                 <w:rStyle w:val="Hipervnculo"/>
@@ -1488,7 +1573,7 @@
               <w:rPr>
                 <w:noProof/>
               </w:rPr>
-              <w:instrText xml:space="preserve"> PAGEREF _Toc229072242 \h </w:instrText>
+              <w:instrText xml:space="preserve"> PAGEREF _Toc229165968 \h </w:instrText>
             </w:r>
             <w:r>
               <w:rPr>
@@ -1505,7 +1590,7 @@
               <w:rPr>
                 <w:noProof/>
               </w:rPr>
-              <w:t>1</w:t>
+              <w:t>12</w:t>
             </w:r>
             <w:r>
               <w:rPr>
@@ -1522,10 +1607,13 @@
               <w:tab w:val="right" w:leader="dot" w:pos="8494"/>
             </w:tabs>
             <w:rPr>
+              <w:rFonts w:asciiTheme="minorHAnsi" w:eastAsiaTheme="minorEastAsia" w:hAnsiTheme="minorHAnsi" w:cstheme="minorBidi"/>
               <w:noProof/>
+              <w:kern w:val="2"/>
+              <w14:ligatures w14:val="standardContextual"/>
             </w:rPr>
           </w:pPr>
-          <w:hyperlink w:anchor="_Toc229072243" w:history="1">
+          <w:hyperlink w:anchor="_Toc229165969" w:history="1">
             <w:r>
               <w:rPr>
                 <w:rStyle w:val="Hipervnculo"/>
@@ -1549,7 +1637,7 @@
               <w:rPr>
                 <w:noProof/>
               </w:rPr>
-              <w:instrText xml:space="preserve"> PAGEREF _Toc229072243 \h </w:instrText>
+              <w:instrText xml:space="preserve"> PAGEREF _Toc229165969 \h </w:instrText>
             </w:r>
             <w:r>
               <w:rPr>
@@ -1566,7 +1654,7 @@
               <w:rPr>
                 <w:noProof/>
               </w:rPr>
-              <w:t>1</w:t>
+              <w:t>13</w:t>
             </w:r>
             <w:r>
               <w:rPr>
@@ -1583,10 +1671,13 @@
               <w:tab w:val="right" w:leader="dot" w:pos="8494"/>
             </w:tabs>
             <w:rPr>
+              <w:rFonts w:asciiTheme="minorHAnsi" w:eastAsiaTheme="minorEastAsia" w:hAnsiTheme="minorHAnsi" w:cstheme="minorBidi"/>
               <w:noProof/>
+              <w:kern w:val="2"/>
+              <w14:ligatures w14:val="standardContextual"/>
             </w:rPr>
           </w:pPr>
-          <w:hyperlink w:anchor="_Toc229072244" w:history="1">
+          <w:hyperlink w:anchor="_Toc229165970" w:history="1">
             <w:r>
               <w:rPr>
                 <w:rStyle w:val="Hipervnculo"/>
@@ -1610,7 +1701,7 @@
               <w:rPr>
                 <w:noProof/>
               </w:rPr>
-              <w:instrText xml:space="preserve"> PAGEREF _Toc229072244 \h </w:instrText>
+              <w:instrText xml:space="preserve"> PAGEREF _Toc229165970 \h </w:instrText>
             </w:r>
             <w:r>
               <w:rPr>
@@ -1627,7 +1718,7 @@
               <w:rPr>
                 <w:noProof/>
               </w:rPr>
-              <w:t>1</w:t>
+              <w:t>13</w:t>
             </w:r>
             <w:r>
               <w:rPr>
@@ -1644,10 +1735,13 @@
               <w:tab w:val="right" w:leader="dot" w:pos="8494"/>
             </w:tabs>
             <w:rPr>
+              <w:rFonts w:asciiTheme="minorHAnsi" w:eastAsiaTheme="minorEastAsia" w:hAnsiTheme="minorHAnsi" w:cstheme="minorBidi"/>
               <w:noProof/>
+              <w:kern w:val="2"/>
+              <w14:ligatures w14:val="standardContextual"/>
             </w:rPr>
           </w:pPr>
-          <w:hyperlink w:anchor="_Toc229072245" w:history="1">
+          <w:hyperlink w:anchor="_Toc229165971" w:history="1">
             <w:r>
               <w:rPr>
                 <w:rStyle w:val="Hipervnculo"/>
@@ -1671,7 +1765,7 @@
               <w:rPr>
                 <w:noProof/>
               </w:rPr>
-              <w:instrText xml:space="preserve"> PAGEREF _Toc229072245 \h </w:instrText>
+              <w:instrText xml:space="preserve"> PAGEREF _Toc229165971 \h </w:instrText>
             </w:r>
             <w:r>
               <w:rPr>
@@ -1688,7 +1782,7 @@
               <w:rPr>
                 <w:noProof/>
               </w:rPr>
-              <w:t>1</w:t>
+              <w:t>15</w:t>
             </w:r>
             <w:r>
               <w:rPr>
@@ -1705,10 +1799,13 @@
               <w:tab w:val="right" w:leader="dot" w:pos="8494"/>
             </w:tabs>
             <w:rPr>
+              <w:rFonts w:asciiTheme="minorHAnsi" w:eastAsiaTheme="minorEastAsia" w:hAnsiTheme="minorHAnsi" w:cstheme="minorBidi"/>
               <w:noProof/>
+              <w:kern w:val="2"/>
+              <w14:ligatures w14:val="standardContextual"/>
             </w:rPr>
           </w:pPr>
-          <w:hyperlink w:anchor="_Toc229072246" w:history="1">
+          <w:hyperlink w:anchor="_Toc229165972" w:history="1">
             <w:r>
               <w:rPr>
                 <w:rStyle w:val="Hipervnculo"/>
@@ -1732,7 +1829,7 @@
               <w:rPr>
                 <w:noProof/>
               </w:rPr>
-              <w:instrText xml:space="preserve"> PAGEREF _Toc229072246 \h </w:instrText>
+              <w:instrText xml:space="preserve"> PAGEREF _Toc229165972 \h </w:instrText>
             </w:r>
             <w:r>
               <w:rPr>
@@ -1749,7 +1846,7 @@
               <w:rPr>
                 <w:noProof/>
               </w:rPr>
-              <w:t>1</w:t>
+              <w:t>16</w:t>
             </w:r>
             <w:r>
               <w:rPr>
@@ -1766,10 +1863,13 @@
               <w:tab w:val="right" w:leader="dot" w:pos="8494"/>
             </w:tabs>
             <w:rPr>
+              <w:rFonts w:asciiTheme="minorHAnsi" w:eastAsiaTheme="minorEastAsia" w:hAnsiTheme="minorHAnsi" w:cstheme="minorBidi"/>
               <w:noProof/>
+              <w:kern w:val="2"/>
+              <w14:ligatures w14:val="standardContextual"/>
             </w:rPr>
           </w:pPr>
-          <w:hyperlink w:anchor="_Toc229072247" w:history="1">
+          <w:hyperlink w:anchor="_Toc229165973" w:history="1">
             <w:r>
               <w:rPr>
                 <w:rStyle w:val="Hipervnculo"/>
@@ -1793,7 +1893,7 @@
               <w:rPr>
                 <w:noProof/>
               </w:rPr>
-              <w:instrText xml:space="preserve"> PAGEREF _Toc229072247 \h </w:instrText>
+              <w:instrText xml:space="preserve"> PAGEREF _Toc229165973 \h </w:instrText>
             </w:r>
             <w:r>
               <w:rPr>
@@ -1810,7 +1910,7 @@
               <w:rPr>
                 <w:noProof/>
               </w:rPr>
-              <w:t>1</w:t>
+              <w:t>17</w:t>
             </w:r>
             <w:r>
               <w:rPr>
@@ -1827,10 +1927,13 @@
               <w:tab w:val="right" w:leader="dot" w:pos="8494"/>
             </w:tabs>
             <w:rPr>
+              <w:rFonts w:asciiTheme="minorHAnsi" w:eastAsiaTheme="minorEastAsia" w:hAnsiTheme="minorHAnsi" w:cstheme="minorBidi"/>
               <w:noProof/>
+              <w:kern w:val="2"/>
+              <w14:ligatures w14:val="standardContextual"/>
             </w:rPr>
           </w:pPr>
-          <w:hyperlink w:anchor="_Toc229072248" w:history="1">
+          <w:hyperlink w:anchor="_Toc229165974" w:history="1">
             <w:r>
               <w:rPr>
                 <w:rStyle w:val="Hipervnculo"/>
@@ -1854,7 +1957,7 @@
               <w:rPr>
                 <w:noProof/>
               </w:rPr>
-              <w:instrText xml:space="preserve"> PAGEREF _Toc229072248 \h </w:instrText>
+              <w:instrText xml:space="preserve"> PAGEREF _Toc229165974 \h </w:instrText>
             </w:r>
             <w:r>
               <w:rPr>
@@ -1871,7 +1974,7 @@
               <w:rPr>
                 <w:noProof/>
               </w:rPr>
-              <w:t>1</w:t>
+              <w:t>19</w:t>
             </w:r>
             <w:r>
               <w:rPr>
@@ -1888,10 +1991,13 @@
               <w:tab w:val="right" w:leader="dot" w:pos="8494"/>
             </w:tabs>
             <w:rPr>
+              <w:rFonts w:asciiTheme="minorHAnsi" w:eastAsiaTheme="minorEastAsia" w:hAnsiTheme="minorHAnsi" w:cstheme="minorBidi"/>
               <w:noProof/>
+              <w:kern w:val="2"/>
+              <w14:ligatures w14:val="standardContextual"/>
             </w:rPr>
           </w:pPr>
-          <w:hyperlink w:anchor="_Toc229072249" w:history="1">
+          <w:hyperlink w:anchor="_Toc229165975" w:history="1">
             <w:r>
               <w:rPr>
                 <w:rStyle w:val="Hipervnculo"/>
@@ -1915,7 +2021,7 @@
               <w:rPr>
                 <w:noProof/>
               </w:rPr>
-              <w:instrText xml:space="preserve"> PAGEREF _Toc229072249 \h </w:instrText>
+              <w:instrText xml:space="preserve"> PAGEREF _Toc229165975 \h </w:instrText>
             </w:r>
             <w:r>
               <w:rPr>
@@ -1932,7 +2038,7 @@
               <w:rPr>
                 <w:noProof/>
               </w:rPr>
-              <w:t>1</w:t>
+              <w:t>19</w:t>
             </w:r>
             <w:r>
               <w:rPr>
@@ -1949,10 +2055,13 @@
               <w:tab w:val="right" w:leader="dot" w:pos="8494"/>
             </w:tabs>
             <w:rPr>
+              <w:rFonts w:asciiTheme="minorHAnsi" w:eastAsiaTheme="minorEastAsia" w:hAnsiTheme="minorHAnsi" w:cstheme="minorBidi"/>
               <w:noProof/>
+              <w:kern w:val="2"/>
+              <w14:ligatures w14:val="standardContextual"/>
             </w:rPr>
           </w:pPr>
-          <w:hyperlink w:anchor="_Toc229072250" w:history="1">
+          <w:hyperlink w:anchor="_Toc229165976" w:history="1">
             <w:r>
               <w:rPr>
                 <w:rStyle w:val="Hipervnculo"/>
@@ -1976,7 +2085,7 @@
               <w:rPr>
                 <w:noProof/>
               </w:rPr>
-              <w:instrText xml:space="preserve"> PAGEREF _Toc229072250 \h </w:instrText>
+              <w:instrText xml:space="preserve"> PAGEREF _Toc229165976 \h </w:instrText>
             </w:r>
             <w:r>
               <w:rPr>
@@ -1993,7 +2102,7 @@
               <w:rPr>
                 <w:noProof/>
               </w:rPr>
-              <w:t>1</w:t>
+              <w:t>19</w:t>
             </w:r>
             <w:r>
               <w:rPr>
@@ -2010,10 +2119,13 @@
               <w:tab w:val="right" w:leader="dot" w:pos="8494"/>
             </w:tabs>
             <w:rPr>
+              <w:rFonts w:asciiTheme="minorHAnsi" w:eastAsiaTheme="minorEastAsia" w:hAnsiTheme="minorHAnsi" w:cstheme="minorBidi"/>
               <w:noProof/>
+              <w:kern w:val="2"/>
+              <w14:ligatures w14:val="standardContextual"/>
             </w:rPr>
           </w:pPr>
-          <w:hyperlink w:anchor="_Toc229072251" w:history="1">
+          <w:hyperlink w:anchor="_Toc229165977" w:history="1">
             <w:r>
               <w:rPr>
                 <w:rStyle w:val="Hipervnculo"/>
@@ -2037,7 +2149,7 @@
               <w:rPr>
                 <w:noProof/>
               </w:rPr>
-              <w:instrText xml:space="preserve"> PAGEREF _Toc229072251 \h </w:instrText>
+              <w:instrText xml:space="preserve"> PAGEREF _Toc229165977 \h </w:instrText>
             </w:r>
             <w:r>
               <w:rPr>
@@ -2054,7 +2166,7 @@
               <w:rPr>
                 <w:noProof/>
               </w:rPr>
-              <w:t>1</w:t>
+              <w:t>21</w:t>
             </w:r>
             <w:r>
               <w:rPr>
@@ -2071,10 +2183,13 @@
               <w:tab w:val="right" w:leader="dot" w:pos="8494"/>
             </w:tabs>
             <w:rPr>
+              <w:rFonts w:asciiTheme="minorHAnsi" w:eastAsiaTheme="minorEastAsia" w:hAnsiTheme="minorHAnsi" w:cstheme="minorBidi"/>
               <w:noProof/>
+              <w:kern w:val="2"/>
+              <w14:ligatures w14:val="standardContextual"/>
             </w:rPr>
           </w:pPr>
-          <w:hyperlink w:anchor="_Toc229072252" w:history="1">
+          <w:hyperlink w:anchor="_Toc229165978" w:history="1">
             <w:r>
               <w:rPr>
                 <w:rStyle w:val="Hipervnculo"/>
@@ -2098,7 +2213,7 @@
               <w:rPr>
                 <w:noProof/>
               </w:rPr>
-              <w:instrText xml:space="preserve"> PAGEREF _Toc229072252 \h </w:instrText>
+              <w:instrText xml:space="preserve"> PAGEREF _Toc229165978 \h </w:instrText>
             </w:r>
             <w:r>
               <w:rPr>
@@ -2115,7 +2230,7 @@
               <w:rPr>
                 <w:noProof/>
               </w:rPr>
-              <w:t>1</w:t>
+              <w:t>21</w:t>
             </w:r>
             <w:r>
               <w:rPr>
@@ -2132,10 +2247,13 @@
               <w:tab w:val="right" w:leader="dot" w:pos="8494"/>
             </w:tabs>
             <w:rPr>
+              <w:rFonts w:asciiTheme="minorHAnsi" w:eastAsiaTheme="minorEastAsia" w:hAnsiTheme="minorHAnsi" w:cstheme="minorBidi"/>
               <w:noProof/>
+              <w:kern w:val="2"/>
+              <w14:ligatures w14:val="standardContextual"/>
             </w:rPr>
           </w:pPr>
-          <w:hyperlink w:anchor="_Toc229072253" w:history="1">
+          <w:hyperlink w:anchor="_Toc229165979" w:history="1">
             <w:r>
               <w:rPr>
                 <w:rStyle w:val="Hipervnculo"/>
@@ -2159,7 +2277,7 @@
               <w:rPr>
                 <w:noProof/>
               </w:rPr>
-              <w:instrText xml:space="preserve"> PAGEREF _Toc229072253 \h </w:instrText>
+              <w:instrText xml:space="preserve"> PAGEREF _Toc229165979 \h </w:instrText>
             </w:r>
             <w:r>
               <w:rPr>
@@ -2176,7 +2294,7 @@
               <w:rPr>
                 <w:noProof/>
               </w:rPr>
-              <w:t>1</w:t>
+              <w:t>23</w:t>
             </w:r>
             <w:r>
               <w:rPr>
@@ -2193,10 +2311,13 @@
               <w:tab w:val="right" w:leader="dot" w:pos="8494"/>
             </w:tabs>
             <w:rPr>
+              <w:rFonts w:asciiTheme="minorHAnsi" w:eastAsiaTheme="minorEastAsia" w:hAnsiTheme="minorHAnsi" w:cstheme="minorBidi"/>
               <w:noProof/>
+              <w:kern w:val="2"/>
+              <w14:ligatures w14:val="standardContextual"/>
             </w:rPr>
           </w:pPr>
-          <w:hyperlink w:anchor="_Toc229072254" w:history="1">
+          <w:hyperlink w:anchor="_Toc229165980" w:history="1">
             <w:r>
               <w:rPr>
                 <w:rStyle w:val="Hipervnculo"/>
@@ -2220,7 +2341,7 @@
               <w:rPr>
                 <w:noProof/>
               </w:rPr>
-              <w:instrText xml:space="preserve"> PAGEREF _Toc229072254 \h </w:instrText>
+              <w:instrText xml:space="preserve"> PAGEREF _Toc229165980 \h </w:instrText>
             </w:r>
             <w:r>
               <w:rPr>
@@ -2237,7 +2358,7 @@
               <w:rPr>
                 <w:noProof/>
               </w:rPr>
-              <w:t>1</w:t>
+              <w:t>24</w:t>
             </w:r>
             <w:r>
               <w:rPr>
@@ -2254,10 +2375,13 @@
               <w:tab w:val="right" w:leader="dot" w:pos="8494"/>
             </w:tabs>
             <w:rPr>
+              <w:rFonts w:asciiTheme="minorHAnsi" w:eastAsiaTheme="minorEastAsia" w:hAnsiTheme="minorHAnsi" w:cstheme="minorBidi"/>
               <w:noProof/>
+              <w:kern w:val="2"/>
+              <w14:ligatures w14:val="standardContextual"/>
             </w:rPr>
           </w:pPr>
-          <w:hyperlink w:anchor="_Toc229072255" w:history="1">
+          <w:hyperlink w:anchor="_Toc229165981" w:history="1">
             <w:r>
               <w:rPr>
                 <w:rStyle w:val="Hipervnculo"/>
@@ -2281,7 +2405,7 @@
               <w:rPr>
                 <w:noProof/>
               </w:rPr>
-              <w:instrText xml:space="preserve"> PAGEREF _Toc229072255 \h </w:instrText>
+              <w:instrText xml:space="preserve"> PAGEREF _Toc229165981 \h </w:instrText>
             </w:r>
             <w:r>
               <w:rPr>
@@ -2298,7 +2422,7 @@
               <w:rPr>
                 <w:noProof/>
               </w:rPr>
-              <w:t>1</w:t>
+              <w:t>25</w:t>
             </w:r>
             <w:r>
               <w:rPr>
@@ -2315,10 +2439,13 @@
               <w:tab w:val="right" w:leader="dot" w:pos="8494"/>
             </w:tabs>
             <w:rPr>
+              <w:rFonts w:asciiTheme="minorHAnsi" w:eastAsiaTheme="minorEastAsia" w:hAnsiTheme="minorHAnsi" w:cstheme="minorBidi"/>
               <w:noProof/>
+              <w:kern w:val="2"/>
+              <w14:ligatures w14:val="standardContextual"/>
             </w:rPr>
           </w:pPr>
-          <w:hyperlink w:anchor="_Toc229072256" w:history="1">
+          <w:hyperlink w:anchor="_Toc229165982" w:history="1">
             <w:r>
               <w:rPr>
                 <w:rStyle w:val="Hipervnculo"/>
@@ -2342,7 +2469,7 @@
               <w:rPr>
                 <w:noProof/>
               </w:rPr>
-              <w:instrText xml:space="preserve"> PAGEREF _Toc229072256 \h </w:instrText>
+              <w:instrText xml:space="preserve"> PAGEREF _Toc229165982 \h </w:instrText>
             </w:r>
             <w:r>
               <w:rPr>
@@ -2359,7 +2486,7 @@
               <w:rPr>
                 <w:noProof/>
               </w:rPr>
-              <w:t>1</w:t>
+              <w:t>26</w:t>
             </w:r>
             <w:r>
               <w:rPr>
@@ -2376,10 +2503,13 @@
               <w:tab w:val="right" w:leader="dot" w:pos="8494"/>
             </w:tabs>
             <w:rPr>
+              <w:rFonts w:asciiTheme="minorHAnsi" w:eastAsiaTheme="minorEastAsia" w:hAnsiTheme="minorHAnsi" w:cstheme="minorBidi"/>
               <w:noProof/>
+              <w:kern w:val="2"/>
+              <w14:ligatures w14:val="standardContextual"/>
             </w:rPr>
           </w:pPr>
-          <w:hyperlink w:anchor="_Toc229072257" w:history="1">
+          <w:hyperlink w:anchor="_Toc229165983" w:history="1">
             <w:r>
               <w:rPr>
                 <w:rStyle w:val="Hipervnculo"/>
@@ -2403,7 +2533,7 @@
               <w:rPr>
                 <w:noProof/>
               </w:rPr>
-              <w:instrText xml:space="preserve"> PAGEREF _Toc229072257 \h </w:instrText>
+              <w:instrText xml:space="preserve"> PAGEREF _Toc229165983 \h </w:instrText>
             </w:r>
             <w:r>
               <w:rPr>
@@ -2420,7 +2550,7 @@
               <w:rPr>
                 <w:noProof/>
               </w:rPr>
-              <w:t>1</w:t>
+              <w:t>27</w:t>
             </w:r>
             <w:r>
               <w:rPr>
@@ -2437,10 +2567,13 @@
               <w:tab w:val="right" w:leader="dot" w:pos="8494"/>
             </w:tabs>
             <w:rPr>
+              <w:rFonts w:asciiTheme="minorHAnsi" w:eastAsiaTheme="minorEastAsia" w:hAnsiTheme="minorHAnsi" w:cstheme="minorBidi"/>
               <w:noProof/>
+              <w:kern w:val="2"/>
+              <w14:ligatures w14:val="standardContextual"/>
             </w:rPr>
           </w:pPr>
-          <w:hyperlink w:anchor="_Toc229072258" w:history="1">
+          <w:hyperlink w:anchor="_Toc229165984" w:history="1">
             <w:r>
               <w:rPr>
                 <w:rStyle w:val="Hipervnculo"/>
@@ -2464,7 +2597,7 @@
               <w:rPr>
                 <w:noProof/>
               </w:rPr>
-              <w:instrText xml:space="preserve"> PAGEREF _Toc229072258 \h </w:instrText>
+              <w:instrText xml:space="preserve"> PAGEREF _Toc229165984 \h </w:instrText>
             </w:r>
             <w:r>
               <w:rPr>
@@ -2481,7 +2614,7 @@
               <w:rPr>
                 <w:noProof/>
               </w:rPr>
-              <w:t>1</w:t>
+              <w:t>28</w:t>
             </w:r>
             <w:r>
               <w:rPr>
@@ -2498,10 +2631,13 @@
               <w:tab w:val="right" w:leader="dot" w:pos="8494"/>
             </w:tabs>
             <w:rPr>
+              <w:rFonts w:asciiTheme="minorHAnsi" w:eastAsiaTheme="minorEastAsia" w:hAnsiTheme="minorHAnsi" w:cstheme="minorBidi"/>
               <w:noProof/>
+              <w:kern w:val="2"/>
+              <w14:ligatures w14:val="standardContextual"/>
             </w:rPr>
           </w:pPr>
-          <w:hyperlink w:anchor="_Toc229072259" w:history="1">
+          <w:hyperlink w:anchor="_Toc229165985" w:history="1">
             <w:r>
               <w:rPr>
                 <w:rStyle w:val="Hipervnculo"/>
@@ -2525,7 +2661,7 @@
               <w:rPr>
                 <w:noProof/>
               </w:rPr>
-              <w:instrText xml:space="preserve"> PAGEREF _Toc229072259 \h </w:instrText>
+              <w:instrText xml:space="preserve"> PAGEREF _Toc229165985 \h </w:instrText>
             </w:r>
             <w:r>
               <w:rPr>
@@ -2542,7 +2678,7 @@
               <w:rPr>
                 <w:noProof/>
               </w:rPr>
-              <w:t>1</w:t>
+              <w:t>30</w:t>
             </w:r>
             <w:r>
               <w:rPr>
@@ -2559,10 +2695,13 @@
               <w:tab w:val="right" w:leader="dot" w:pos="8494"/>
             </w:tabs>
             <w:rPr>
+              <w:rFonts w:asciiTheme="minorHAnsi" w:eastAsiaTheme="minorEastAsia" w:hAnsiTheme="minorHAnsi" w:cstheme="minorBidi"/>
               <w:noProof/>
+              <w:kern w:val="2"/>
+              <w14:ligatures w14:val="standardContextual"/>
             </w:rPr>
           </w:pPr>
-          <w:hyperlink w:anchor="_Toc229072260" w:history="1">
+          <w:hyperlink w:anchor="_Toc229165986" w:history="1">
             <w:r>
               <w:rPr>
                 <w:rStyle w:val="Hipervnculo"/>
@@ -2586,7 +2725,7 @@
               <w:rPr>
                 <w:noProof/>
               </w:rPr>
-              <w:instrText xml:space="preserve"> PAGEREF _Toc229072260 \h </w:instrText>
+              <w:instrText xml:space="preserve"> PAGEREF _Toc229165986 \h </w:instrText>
             </w:r>
             <w:r>
               <w:rPr>
@@ -2603,7 +2742,7 @@
               <w:rPr>
                 <w:noProof/>
               </w:rPr>
-              <w:t>1</w:t>
+              <w:t>32</w:t>
             </w:r>
             <w:r>
               <w:rPr>
@@ -2620,10 +2759,13 @@
               <w:tab w:val="right" w:leader="dot" w:pos="8494"/>
             </w:tabs>
             <w:rPr>
+              <w:rFonts w:asciiTheme="minorHAnsi" w:eastAsiaTheme="minorEastAsia" w:hAnsiTheme="minorHAnsi" w:cstheme="minorBidi"/>
               <w:noProof/>
+              <w:kern w:val="2"/>
+              <w14:ligatures w14:val="standardContextual"/>
             </w:rPr>
           </w:pPr>
-          <w:hyperlink w:anchor="_Toc229072261" w:history="1">
+          <w:hyperlink w:anchor="_Toc229165987" w:history="1">
             <w:r>
               <w:rPr>
                 <w:rStyle w:val="Hipervnculo"/>
@@ -2647,7 +2789,7 @@
               <w:rPr>
                 <w:noProof/>
               </w:rPr>
-              <w:instrText xml:space="preserve"> PAGEREF _Toc229072261 \h </w:instrText>
+              <w:instrText xml:space="preserve"> PAGEREF _Toc229165987 \h </w:instrText>
             </w:r>
             <w:r>
               <w:rPr>
@@ -2664,7 +2806,7 @@
               <w:rPr>
                 <w:noProof/>
               </w:rPr>
-              <w:t>1</w:t>
+              <w:t>33</w:t>
             </w:r>
             <w:r>
               <w:rPr>
@@ -2681,10 +2823,13 @@
               <w:tab w:val="right" w:leader="dot" w:pos="8494"/>
             </w:tabs>
             <w:rPr>
+              <w:rFonts w:asciiTheme="minorHAnsi" w:eastAsiaTheme="minorEastAsia" w:hAnsiTheme="minorHAnsi" w:cstheme="minorBidi"/>
               <w:noProof/>
+              <w:kern w:val="2"/>
+              <w14:ligatures w14:val="standardContextual"/>
             </w:rPr>
           </w:pPr>
-          <w:hyperlink w:anchor="_Toc229072262" w:history="1">
+          <w:hyperlink w:anchor="_Toc229165988" w:history="1">
             <w:r>
               <w:rPr>
                 <w:rStyle w:val="Hipervnculo"/>
@@ -2708,7 +2853,7 @@
               <w:rPr>
                 <w:noProof/>
               </w:rPr>
-              <w:instrText xml:space="preserve"> PAGEREF _Toc229072262 \h </w:instrText>
+              <w:instrText xml:space="preserve"> PAGEREF _Toc229165988 \h </w:instrText>
             </w:r>
             <w:r>
               <w:rPr>
@@ -2725,7 +2870,7 @@
               <w:rPr>
                 <w:noProof/>
               </w:rPr>
-              <w:t>1</w:t>
+              <w:t>33</w:t>
             </w:r>
             <w:r>
               <w:rPr>
@@ -2742,10 +2887,13 @@
               <w:tab w:val="right" w:leader="dot" w:pos="8494"/>
             </w:tabs>
             <w:rPr>
+              <w:rFonts w:asciiTheme="minorHAnsi" w:eastAsiaTheme="minorEastAsia" w:hAnsiTheme="minorHAnsi" w:cstheme="minorBidi"/>
               <w:noProof/>
+              <w:kern w:val="2"/>
+              <w14:ligatures w14:val="standardContextual"/>
             </w:rPr>
           </w:pPr>
-          <w:hyperlink w:anchor="_Toc229072263" w:history="1">
+          <w:hyperlink w:anchor="_Toc229165989" w:history="1">
             <w:r>
               <w:rPr>
                 <w:rStyle w:val="Hipervnculo"/>
@@ -2769,7 +2917,7 @@
               <w:rPr>
                 <w:noProof/>
               </w:rPr>
-              <w:instrText xml:space="preserve"> PAGEREF _Toc229072263 \h </w:instrText>
+              <w:instrText xml:space="preserve"> PAGEREF _Toc229165989 \h </w:instrText>
             </w:r>
             <w:r>
               <w:rPr>
@@ -2786,7 +2934,7 @@
               <w:rPr>
                 <w:noProof/>
               </w:rPr>
-              <w:t>1</w:t>
+              <w:t>34</w:t>
             </w:r>
             <w:r>
               <w:rPr>
@@ -2803,10 +2951,13 @@
               <w:tab w:val="right" w:leader="dot" w:pos="8494"/>
             </w:tabs>
             <w:rPr>
+              <w:rFonts w:asciiTheme="minorHAnsi" w:eastAsiaTheme="minorEastAsia" w:hAnsiTheme="minorHAnsi" w:cstheme="minorBidi"/>
               <w:noProof/>
+              <w:kern w:val="2"/>
+              <w14:ligatures w14:val="standardContextual"/>
             </w:rPr>
           </w:pPr>
-          <w:hyperlink w:anchor="_Toc229072264" w:history="1">
+          <w:hyperlink w:anchor="_Toc229165990" w:history="1">
             <w:r>
               <w:rPr>
                 <w:rStyle w:val="Hipervnculo"/>
@@ -2830,7 +2981,7 @@
               <w:rPr>
                 <w:noProof/>
               </w:rPr>
-              <w:instrText xml:space="preserve"> PAGEREF _Toc229072264 \h </w:instrText>
+              <w:instrText xml:space="preserve"> PAGEREF _Toc229165990 \h </w:instrText>
             </w:r>
             <w:r>
               <w:rPr>
@@ -2847,7 +2998,7 @@
               <w:rPr>
                 <w:noProof/>
               </w:rPr>
-              <w:t>1</w:t>
+              <w:t>34</w:t>
             </w:r>
             <w:r>
               <w:rPr>
@@ -2864,10 +3015,13 @@
               <w:tab w:val="right" w:leader="dot" w:pos="8494"/>
             </w:tabs>
             <w:rPr>
+              <w:rFonts w:asciiTheme="minorHAnsi" w:eastAsiaTheme="minorEastAsia" w:hAnsiTheme="minorHAnsi" w:cstheme="minorBidi"/>
               <w:noProof/>
+              <w:kern w:val="2"/>
+              <w14:ligatures w14:val="standardContextual"/>
             </w:rPr>
           </w:pPr>
-          <w:hyperlink w:anchor="_Toc229072265" w:history="1">
+          <w:hyperlink w:anchor="_Toc229165991" w:history="1">
             <w:r>
               <w:rPr>
                 <w:rStyle w:val="Hipervnculo"/>
@@ -2891,7 +3045,7 @@
               <w:rPr>
                 <w:noProof/>
               </w:rPr>
-              <w:instrText xml:space="preserve"> PAGEREF _Toc229072265 \h </w:instrText>
+              <w:instrText xml:space="preserve"> PAGEREF _Toc229165991 \h </w:instrText>
             </w:r>
             <w:r>
               <w:rPr>
@@ -2908,7 +3062,7 @@
               <w:rPr>
                 <w:noProof/>
               </w:rPr>
-              <w:t>1</w:t>
+              <w:t>35</w:t>
             </w:r>
             <w:r>
               <w:rPr>
@@ -2925,10 +3079,13 @@
               <w:tab w:val="right" w:leader="dot" w:pos="8494"/>
             </w:tabs>
             <w:rPr>
+              <w:rFonts w:asciiTheme="minorHAnsi" w:eastAsiaTheme="minorEastAsia" w:hAnsiTheme="minorHAnsi" w:cstheme="minorBidi"/>
               <w:noProof/>
+              <w:kern w:val="2"/>
+              <w14:ligatures w14:val="standardContextual"/>
             </w:rPr>
           </w:pPr>
-          <w:hyperlink w:anchor="_Toc229072266" w:history="1">
+          <w:hyperlink w:anchor="_Toc229165992" w:history="1">
             <w:r>
               <w:rPr>
                 <w:rStyle w:val="Hipervnculo"/>
@@ -2952,7 +3109,7 @@
               <w:rPr>
                 <w:noProof/>
               </w:rPr>
-              <w:instrText xml:space="preserve"> PAGEREF _Toc229072266 \h </w:instrText>
+              <w:instrText xml:space="preserve"> PAGEREF _Toc229165992 \h </w:instrText>
             </w:r>
             <w:r>
               <w:rPr>
@@ -2969,7 +3126,7 @@
               <w:rPr>
                 <w:noProof/>
               </w:rPr>
-              <w:t>1</w:t>
+              <w:t>36</w:t>
             </w:r>
             <w:r>
               <w:rPr>
@@ -2986,10 +3143,13 @@
               <w:tab w:val="right" w:leader="dot" w:pos="8494"/>
             </w:tabs>
             <w:rPr>
+              <w:rFonts w:asciiTheme="minorHAnsi" w:eastAsiaTheme="minorEastAsia" w:hAnsiTheme="minorHAnsi" w:cstheme="minorBidi"/>
               <w:noProof/>
+              <w:kern w:val="2"/>
+              <w14:ligatures w14:val="standardContextual"/>
             </w:rPr>
           </w:pPr>
-          <w:hyperlink w:anchor="_Toc229072267" w:history="1">
+          <w:hyperlink w:anchor="_Toc229165993" w:history="1">
             <w:r>
               <w:rPr>
                 <w:rStyle w:val="Hipervnculo"/>
@@ -3013,7 +3173,7 @@
               <w:rPr>
                 <w:noProof/>
               </w:rPr>
-              <w:instrText xml:space="preserve"> PAGEREF _Toc229072267 \h </w:instrText>
+              <w:instrText xml:space="preserve"> PAGEREF _Toc229165993 \h </w:instrText>
             </w:r>
             <w:r>
               <w:rPr>
@@ -3030,7 +3190,7 @@
               <w:rPr>
                 <w:noProof/>
               </w:rPr>
-              <w:t>1</w:t>
+              <w:t>37</w:t>
             </w:r>
             <w:r>
               <w:rPr>
@@ -3047,10 +3207,13 @@
               <w:tab w:val="right" w:leader="dot" w:pos="8494"/>
             </w:tabs>
             <w:rPr>
+              <w:rFonts w:asciiTheme="minorHAnsi" w:eastAsiaTheme="minorEastAsia" w:hAnsiTheme="minorHAnsi" w:cstheme="minorBidi"/>
               <w:noProof/>
+              <w:kern w:val="2"/>
+              <w14:ligatures w14:val="standardContextual"/>
             </w:rPr>
           </w:pPr>
-          <w:hyperlink w:anchor="_Toc229072268" w:history="1">
+          <w:hyperlink w:anchor="_Toc229165994" w:history="1">
             <w:r>
               <w:rPr>
                 <w:rStyle w:val="Hipervnculo"/>
@@ -3074,7 +3237,7 @@
               <w:rPr>
                 <w:noProof/>
               </w:rPr>
-              <w:instrText xml:space="preserve"> PAGEREF _Toc229072268 \h </w:instrText>
+              <w:instrText xml:space="preserve"> PAGEREF _Toc229165994 \h </w:instrText>
             </w:r>
             <w:r>
               <w:rPr>
@@ -3091,7 +3254,7 @@
               <w:rPr>
                 <w:noProof/>
               </w:rPr>
-              <w:t>1</w:t>
+              <w:t>37</w:t>
             </w:r>
             <w:r>
               <w:rPr>
@@ -3108,10 +3271,13 @@
               <w:tab w:val="right" w:leader="dot" w:pos="8494"/>
             </w:tabs>
             <w:rPr>
+              <w:rFonts w:asciiTheme="minorHAnsi" w:eastAsiaTheme="minorEastAsia" w:hAnsiTheme="minorHAnsi" w:cstheme="minorBidi"/>
               <w:noProof/>
+              <w:kern w:val="2"/>
+              <w14:ligatures w14:val="standardContextual"/>
             </w:rPr>
           </w:pPr>
-          <w:hyperlink w:anchor="_Toc229072269" w:history="1">
+          <w:hyperlink w:anchor="_Toc229165995" w:history="1">
             <w:r>
               <w:rPr>
                 <w:rStyle w:val="Hipervnculo"/>
@@ -3135,7 +3301,7 @@
               <w:rPr>
                 <w:noProof/>
               </w:rPr>
-              <w:instrText xml:space="preserve"> PAGEREF _Toc229072269 \h </w:instrText>
+              <w:instrText xml:space="preserve"> PAGEREF _Toc229165995 \h </w:instrText>
             </w:r>
             <w:r>
               <w:rPr>
@@ -3152,7 +3318,7 @@
               <w:rPr>
                 <w:noProof/>
               </w:rPr>
-              <w:t>1</w:t>
+              <w:t>37</w:t>
             </w:r>
             <w:r>
               <w:rPr>
@@ -3169,10 +3335,13 @@
               <w:tab w:val="right" w:leader="dot" w:pos="8494"/>
             </w:tabs>
             <w:rPr>
+              <w:rFonts w:asciiTheme="minorHAnsi" w:eastAsiaTheme="minorEastAsia" w:hAnsiTheme="minorHAnsi" w:cstheme="minorBidi"/>
               <w:noProof/>
+              <w:kern w:val="2"/>
+              <w14:ligatures w14:val="standardContextual"/>
             </w:rPr>
           </w:pPr>
-          <w:hyperlink w:anchor="_Toc229072270" w:history="1">
+          <w:hyperlink w:anchor="_Toc229165996" w:history="1">
             <w:r>
               <w:rPr>
                 <w:rStyle w:val="Hipervnculo"/>
@@ -3196,7 +3365,7 @@
               <w:rPr>
                 <w:noProof/>
               </w:rPr>
-              <w:instrText xml:space="preserve"> PAGEREF _Toc229072270 \h </w:instrText>
+              <w:instrText xml:space="preserve"> PAGEREF _Toc229165996 \h </w:instrText>
             </w:r>
             <w:r>
               <w:rPr>
@@ -3213,7 +3382,7 @@
               <w:rPr>
                 <w:noProof/>
               </w:rPr>
-              <w:t>1</w:t>
+              <w:t>38</w:t>
             </w:r>
             <w:r>
               <w:rPr>
@@ -3230,14 +3399,18 @@
               <w:tab w:val="right" w:leader="dot" w:pos="8494"/>
             </w:tabs>
             <w:rPr>
+              <w:rFonts w:asciiTheme="minorHAnsi" w:eastAsiaTheme="minorEastAsia" w:hAnsiTheme="minorHAnsi" w:cstheme="minorBidi"/>
               <w:noProof/>
+              <w:kern w:val="2"/>
+              <w14:ligatures w14:val="standardContextual"/>
             </w:rPr>
           </w:pPr>
-          <w:hyperlink w:anchor="_Toc229072271" w:history="1">
+          <w:hyperlink w:anchor="_Toc229165997" w:history="1">
             <w:r>
               <w:rPr>
                 <w:rStyle w:val="Hipervnculo"/>
                 <w:noProof/>
+                <w:lang w:val="en-GB"/>
               </w:rPr>
               <w:t>Bibliografía</w:t>
             </w:r>
@@ -3257,7 +3430,7 @@
               <w:rPr>
                 <w:noProof/>
               </w:rPr>
-              <w:instrText xml:space="preserve"> PAGEREF _Toc229072271 \h </w:instrText>
+              <w:instrText xml:space="preserve"> PAGEREF _Toc229165997 \h </w:instrText>
             </w:r>
             <w:r>
               <w:rPr>
@@ -3274,7 +3447,7 @@
               <w:rPr>
                 <w:noProof/>
               </w:rPr>
-              <w:t>1</w:t>
+              <w:t>39</w:t>
             </w:r>
             <w:r>
               <w:rPr>
@@ -3291,10 +3464,13 @@
               <w:tab w:val="right" w:leader="dot" w:pos="8494"/>
             </w:tabs>
             <w:rPr>
+              <w:rFonts w:asciiTheme="minorHAnsi" w:eastAsiaTheme="minorEastAsia" w:hAnsiTheme="minorHAnsi" w:cstheme="minorBidi"/>
               <w:noProof/>
+              <w:kern w:val="2"/>
+              <w14:ligatures w14:val="standardContextual"/>
             </w:rPr>
           </w:pPr>
-          <w:hyperlink w:anchor="_Toc229072272" w:history="1">
+          <w:hyperlink w:anchor="_Toc229165998" w:history="1">
             <w:r>
               <w:rPr>
                 <w:rStyle w:val="Hipervnculo"/>
@@ -3318,7 +3494,7 @@
               <w:rPr>
                 <w:noProof/>
               </w:rPr>
-              <w:instrText xml:space="preserve"> PAGEREF _Toc229072272 \h </w:instrText>
+              <w:instrText xml:space="preserve"> PAGEREF _Toc229165998 \h </w:instrText>
             </w:r>
             <w:r>
               <w:rPr>
@@ -3335,7 +3511,7 @@
               <w:rPr>
                 <w:noProof/>
               </w:rPr>
-              <w:t>1</w:t>
+              <w:t>40</w:t>
             </w:r>
             <w:r>
               <w:rPr>
@@ -3352,10 +3528,13 @@
               <w:tab w:val="right" w:leader="dot" w:pos="8494"/>
             </w:tabs>
             <w:rPr>
+              <w:rFonts w:asciiTheme="minorHAnsi" w:eastAsiaTheme="minorEastAsia" w:hAnsiTheme="minorHAnsi" w:cstheme="minorBidi"/>
               <w:noProof/>
+              <w:kern w:val="2"/>
+              <w14:ligatures w14:val="standardContextual"/>
             </w:rPr>
           </w:pPr>
-          <w:hyperlink w:anchor="_Toc229072273" w:history="1">
+          <w:hyperlink w:anchor="_Toc229165999" w:history="1">
             <w:r>
               <w:rPr>
                 <w:rStyle w:val="Hipervnculo"/>
@@ -3379,7 +3558,7 @@
               <w:rPr>
                 <w:noProof/>
               </w:rPr>
-              <w:instrText xml:space="preserve"> PAGEREF _Toc229072273 \h </w:instrText>
+              <w:instrText xml:space="preserve"> PAGEREF _Toc229165999 \h </w:instrText>
             </w:r>
             <w:r>
               <w:rPr>
@@ -3396,7 +3575,7 @@
               <w:rPr>
                 <w:noProof/>
               </w:rPr>
-              <w:t>1</w:t>
+              <w:t>40</w:t>
             </w:r>
             <w:r>
               <w:rPr>
@@ -3413,10 +3592,13 @@
               <w:tab w:val="right" w:leader="dot" w:pos="8494"/>
             </w:tabs>
             <w:rPr>
+              <w:rFonts w:asciiTheme="minorHAnsi" w:eastAsiaTheme="minorEastAsia" w:hAnsiTheme="minorHAnsi" w:cstheme="minorBidi"/>
               <w:noProof/>
+              <w:kern w:val="2"/>
+              <w14:ligatures w14:val="standardContextual"/>
             </w:rPr>
           </w:pPr>
-          <w:hyperlink w:anchor="_Toc229072274" w:history="1">
+          <w:hyperlink w:anchor="_Toc229166000" w:history="1">
             <w:r>
               <w:rPr>
                 <w:rStyle w:val="Hipervnculo"/>
@@ -3440,7 +3622,7 @@
               <w:rPr>
                 <w:noProof/>
               </w:rPr>
-              <w:instrText xml:space="preserve"> PAGEREF _Toc229072274 \h </w:instrText>
+              <w:instrText xml:space="preserve"> PAGEREF _Toc229166000 \h </w:instrText>
             </w:r>
             <w:r>
               <w:rPr>
@@ -3457,7 +3639,7 @@
               <w:rPr>
                 <w:noProof/>
               </w:rPr>
-              <w:t>1</w:t>
+              <w:t>40</w:t>
             </w:r>
             <w:r>
               <w:rPr>
@@ -3474,10 +3656,13 @@
               <w:tab w:val="right" w:leader="dot" w:pos="8494"/>
             </w:tabs>
             <w:rPr>
+              <w:rFonts w:asciiTheme="minorHAnsi" w:eastAsiaTheme="minorEastAsia" w:hAnsiTheme="minorHAnsi" w:cstheme="minorBidi"/>
               <w:noProof/>
+              <w:kern w:val="2"/>
+              <w14:ligatures w14:val="standardContextual"/>
             </w:rPr>
           </w:pPr>
-          <w:hyperlink w:anchor="_Toc229072275" w:history="1">
+          <w:hyperlink w:anchor="_Toc229166001" w:history="1">
             <w:r>
               <w:rPr>
                 <w:rStyle w:val="Hipervnculo"/>
@@ -3501,7 +3686,7 @@
               <w:rPr>
                 <w:noProof/>
               </w:rPr>
-              <w:instrText xml:space="preserve"> PAGEREF _Toc229072275 \h </w:instrText>
+              <w:instrText xml:space="preserve"> PAGEREF _Toc229166001 \h </w:instrText>
             </w:r>
             <w:r>
               <w:rPr>
@@ -3518,7 +3703,7 @@
               <w:rPr>
                 <w:noProof/>
               </w:rPr>
-              <w:t>1</w:t>
+              <w:t>40</w:t>
             </w:r>
             <w:r>
               <w:rPr>
@@ -3535,10 +3720,13 @@
               <w:tab w:val="right" w:leader="dot" w:pos="8494"/>
             </w:tabs>
             <w:rPr>
+              <w:rFonts w:asciiTheme="minorHAnsi" w:eastAsiaTheme="minorEastAsia" w:hAnsiTheme="minorHAnsi" w:cstheme="minorBidi"/>
               <w:noProof/>
+              <w:kern w:val="2"/>
+              <w14:ligatures w14:val="standardContextual"/>
             </w:rPr>
           </w:pPr>
-          <w:hyperlink w:anchor="_Toc229072276" w:history="1">
+          <w:hyperlink w:anchor="_Toc229166002" w:history="1">
             <w:r>
               <w:rPr>
                 <w:rStyle w:val="Hipervnculo"/>
@@ -3562,7 +3750,7 @@
               <w:rPr>
                 <w:noProof/>
               </w:rPr>
-              <w:instrText xml:space="preserve"> PAGEREF _Toc229072276 \h </w:instrText>
+              <w:instrText xml:space="preserve"> PAGEREF _Toc229166002 \h </w:instrText>
             </w:r>
             <w:r>
               <w:rPr>
@@ -3579,7 +3767,7 @@
               <w:rPr>
                 <w:noProof/>
               </w:rPr>
-              <w:t>1</w:t>
+              <w:t>40</w:t>
             </w:r>
             <w:r>
               <w:rPr>
@@ -3596,10 +3784,13 @@
               <w:tab w:val="right" w:leader="dot" w:pos="8494"/>
             </w:tabs>
             <w:rPr>
+              <w:rFonts w:asciiTheme="minorHAnsi" w:eastAsiaTheme="minorEastAsia" w:hAnsiTheme="minorHAnsi" w:cstheme="minorBidi"/>
               <w:noProof/>
+              <w:kern w:val="2"/>
+              <w14:ligatures w14:val="standardContextual"/>
             </w:rPr>
           </w:pPr>
-          <w:hyperlink w:anchor="_Toc229072277" w:history="1">
+          <w:hyperlink w:anchor="_Toc229166003" w:history="1">
             <w:r>
               <w:rPr>
                 <w:rStyle w:val="Hipervnculo"/>
@@ -3623,7 +3814,7 @@
               <w:rPr>
                 <w:noProof/>
               </w:rPr>
-              <w:instrText xml:space="preserve"> PAGEREF _Toc229072277 \h </w:instrText>
+              <w:instrText xml:space="preserve"> PAGEREF _Toc229166003 \h </w:instrText>
             </w:r>
             <w:r>
               <w:rPr>
@@ -3640,7 +3831,7 @@
               <w:rPr>
                 <w:noProof/>
               </w:rPr>
-              <w:t>1</w:t>
+              <w:t>40</w:t>
             </w:r>
             <w:r>
               <w:rPr>
@@ -3657,10 +3848,13 @@
               <w:tab w:val="right" w:leader="dot" w:pos="8494"/>
             </w:tabs>
             <w:rPr>
+              <w:rFonts w:asciiTheme="minorHAnsi" w:eastAsiaTheme="minorEastAsia" w:hAnsiTheme="minorHAnsi" w:cstheme="minorBidi"/>
               <w:noProof/>
+              <w:kern w:val="2"/>
+              <w14:ligatures w14:val="standardContextual"/>
             </w:rPr>
           </w:pPr>
-          <w:hyperlink w:anchor="_Toc229072278" w:history="1">
+          <w:hyperlink w:anchor="_Toc229166004" w:history="1">
             <w:r>
               <w:rPr>
                 <w:rStyle w:val="Hipervnculo"/>
@@ -3684,7 +3878,7 @@
               <w:rPr>
                 <w:noProof/>
               </w:rPr>
-              <w:instrText xml:space="preserve"> PAGEREF _Toc229072278 \h </w:instrText>
+              <w:instrText xml:space="preserve"> PAGEREF _Toc229166004 \h </w:instrText>
             </w:r>
             <w:r>
               <w:rPr>
@@ -3701,7 +3895,7 @@
               <w:rPr>
                 <w:noProof/>
               </w:rPr>
-              <w:t>1</w:t>
+              <w:t>41</w:t>
             </w:r>
             <w:r>
               <w:rPr>
@@ -3727,7 +3921,7 @@
       <w:pPr>
         <w:pStyle w:val="Ttulo1"/>
       </w:pPr>
-      <w:bookmarkStart w:id="4" w:name="_Toc229072232"/>
+      <w:bookmarkStart w:id="4" w:name="_Toc229165958"/>
       <w:r>
         <w:lastRenderedPageBreak/>
         <w:t>Índice de Figuras y Tablas</w:t>
@@ -3738,7 +3932,7 @@
       <w:pPr>
         <w:pStyle w:val="Ttulo2"/>
       </w:pPr>
-      <w:bookmarkStart w:id="5" w:name="_Toc229072233"/>
+      <w:bookmarkStart w:id="5" w:name="_Toc229165959"/>
       <w:r>
         <w:t>Índice de Figuras</w:t>
       </w:r>
@@ -3954,7 +4148,7 @@
       <w:pPr>
         <w:pStyle w:val="Ttulo2"/>
       </w:pPr>
-      <w:bookmarkStart w:id="6" w:name="_Toc229072234"/>
+      <w:bookmarkStart w:id="6" w:name="_Toc229165960"/>
       <w:r>
         <w:t>Índice de Tablas</w:t>
       </w:r>
@@ -4067,7 +4261,7 @@
       <w:pPr>
         <w:pStyle w:val="Ttulo1"/>
       </w:pPr>
-      <w:bookmarkStart w:id="7" w:name="_Toc229072235"/>
+      <w:bookmarkStart w:id="7" w:name="_Toc229165961"/>
       <w:r>
         <w:lastRenderedPageBreak/>
         <w:t>1. Introducción y Objetivos del Proyecto</w:t>
@@ -4078,7 +4272,7 @@
       <w:pPr>
         <w:pStyle w:val="Ttulo2"/>
       </w:pPr>
-      <w:bookmarkStart w:id="8" w:name="_Toc229072236"/>
+      <w:bookmarkStart w:id="8" w:name="_Toc229165962"/>
       <w:r>
         <w:t>1.1 Motivación</w:t>
       </w:r>
@@ -4182,7 +4376,7 @@
       <w:pPr>
         <w:pStyle w:val="Ttulo2"/>
       </w:pPr>
-      <w:bookmarkStart w:id="9" w:name="_Toc229072237"/>
+      <w:bookmarkStart w:id="9" w:name="_Toc229165963"/>
       <w:r>
         <w:t>1.2 Objetivos del Proyecto</w:t>
       </w:r>
@@ -4418,7 +4612,7 @@
       <w:pPr>
         <w:pStyle w:val="Ttulo1"/>
       </w:pPr>
-      <w:bookmarkStart w:id="10" w:name="_Toc229072238"/>
+      <w:bookmarkStart w:id="10" w:name="_Toc229165964"/>
       <w:r>
         <w:lastRenderedPageBreak/>
         <w:t>2. Análisis del Problema y Justificación de la Solución</w:t>
@@ -4429,7 +4623,7 @@
       <w:pPr>
         <w:pStyle w:val="Ttulo2"/>
       </w:pPr>
-      <w:bookmarkStart w:id="11" w:name="_Toc229072239"/>
+      <w:bookmarkStart w:id="11" w:name="_Toc229165965"/>
       <w:r>
         <w:t>2.1 Análisis del Problema</w:t>
       </w:r>
@@ -4523,7 +4717,7 @@
       <w:pPr>
         <w:pStyle w:val="Ttulo2"/>
       </w:pPr>
-      <w:bookmarkStart w:id="12" w:name="_Toc229072240"/>
+      <w:bookmarkStart w:id="12" w:name="_Toc229165966"/>
       <w:r>
         <w:t>2.2 Justificación de la Solución</w:t>
       </w:r>
@@ -4704,7 +4898,7 @@
       <w:pPr>
         <w:pStyle w:val="Ttulo2"/>
       </w:pPr>
-      <w:bookmarkStart w:id="13" w:name="_Toc229072241"/>
+      <w:bookmarkStart w:id="13" w:name="_Toc229165967"/>
       <w:r>
         <w:t>2.3 Requisitos Funcionales</w:t>
       </w:r>
@@ -5931,7 +6125,6 @@
       <w:pPr>
         <w:pStyle w:val="Fuerte1"/>
       </w:pPr>
-      <w:bookmarkStart w:id="15" w:name="_Toc229072242"/>
     </w:p>
     <w:p>
       <w:pPr>
@@ -5948,6 +6141,7 @@
       <w:pPr>
         <w:pStyle w:val="Ttulo2"/>
       </w:pPr>
+      <w:bookmarkStart w:id="15" w:name="_Toc229165968"/>
       <w:r>
         <w:lastRenderedPageBreak/>
         <w:t>2.4 Requisitos No Funcionales</w:t>
@@ -6718,7 +6912,7 @@
       <w:pPr>
         <w:pStyle w:val="Ttulo1"/>
       </w:pPr>
-      <w:bookmarkStart w:id="17" w:name="_Toc229072243"/>
+      <w:bookmarkStart w:id="17" w:name="_Toc229165969"/>
       <w:r>
         <w:lastRenderedPageBreak/>
         <w:t>3. Diseño del Sistema</w:t>
@@ -6729,7 +6923,7 @@
       <w:pPr>
         <w:pStyle w:val="Ttulo2"/>
       </w:pPr>
-      <w:bookmarkStart w:id="18" w:name="_Toc229072244"/>
+      <w:bookmarkStart w:id="18" w:name="_Toc229165970"/>
       <w:r>
         <w:t>3.1 Arquitectura de la Aplicación</w:t>
       </w:r>
@@ -7520,7 +7714,6 @@
           <w:szCs w:val="26"/>
         </w:rPr>
       </w:pPr>
-      <w:bookmarkStart w:id="21" w:name="_Toc229072245"/>
       <w:r>
         <w:br w:type="page"/>
       </w:r>
@@ -7529,6 +7722,7 @@
       <w:pPr>
         <w:pStyle w:val="Ttulo2"/>
       </w:pPr>
+      <w:bookmarkStart w:id="21" w:name="_Toc229165971"/>
       <w:r>
         <w:lastRenderedPageBreak/>
         <w:t xml:space="preserve">3.2 Modelo de Datos — Cloud </w:t>
@@ -7697,7 +7891,6 @@
           <w:szCs w:val="26"/>
         </w:rPr>
       </w:pPr>
-      <w:bookmarkStart w:id="23" w:name="_Toc229072246"/>
       <w:r>
         <w:br w:type="page"/>
       </w:r>
@@ -7706,6 +7899,7 @@
       <w:pPr>
         <w:pStyle w:val="Ttulo2"/>
       </w:pPr>
+      <w:bookmarkStart w:id="23" w:name="_Toc229165972"/>
       <w:r>
         <w:lastRenderedPageBreak/>
         <w:t>3.3 Diagrama de Casos de Uso</w:t>
@@ -9273,7 +9467,7 @@
       <w:pPr>
         <w:pStyle w:val="Ttulo2"/>
       </w:pPr>
-      <w:bookmarkStart w:id="27" w:name="_Toc229072247"/>
+      <w:bookmarkStart w:id="27" w:name="_Toc229165973"/>
       <w:r>
         <w:t>3.4 Diagrama de Clases</w:t>
       </w:r>
@@ -11651,6 +11845,7 @@
               <w:jc w:val="both"/>
             </w:pPr>
             <w:proofErr w:type="spellStart"/>
+            <w:proofErr w:type="gramStart"/>
             <w:r>
               <w:rPr>
                 <w:sz w:val="20"/>
@@ -11664,7 +11859,15 @@
                 <w:sz w:val="20"/>
                 <w:szCs w:val="20"/>
               </w:rPr>
-              <w:t>(mensaje, usuario), Error(mensaje)</w:t>
+              <w:t>(</w:t>
+            </w:r>
+            <w:proofErr w:type="gramEnd"/>
+            <w:r>
+              <w:rPr>
+                <w:sz w:val="20"/>
+                <w:szCs w:val="20"/>
+              </w:rPr>
+              <w:t>mensaje, usuario), Error(mensaje)</w:t>
             </w:r>
           </w:p>
         </w:tc>
@@ -11800,7 +12003,7 @@
       <w:pPr>
         <w:pStyle w:val="Ttulo1"/>
       </w:pPr>
-      <w:bookmarkStart w:id="29" w:name="_Toc229072248"/>
+      <w:bookmarkStart w:id="29" w:name="_Toc229165974"/>
       <w:r>
         <w:lastRenderedPageBreak/>
         <w:t>4. Desarrollo del Proyecto</w:t>
@@ -11811,7 +12014,7 @@
       <w:pPr>
         <w:pStyle w:val="Ttulo2"/>
       </w:pPr>
-      <w:bookmarkStart w:id="30" w:name="_Toc229072249"/>
+      <w:bookmarkStart w:id="30" w:name="_Toc229165975"/>
       <w:r>
         <w:t>4.1 Tecnologías y Herramientas Utilizadas</w:t>
       </w:r>
@@ -13028,7 +13231,7 @@
       <w:pPr>
         <w:pStyle w:val="Ttulo2"/>
       </w:pPr>
-      <w:bookmarkStart w:id="32" w:name="_Toc229072250"/>
+      <w:bookmarkStart w:id="32" w:name="_Toc229165976"/>
       <w:r>
         <w:t>4.2 Descripción de la Arquitectura</w:t>
       </w:r>
@@ -15017,7 +15220,6 @@
           <w:szCs w:val="26"/>
         </w:rPr>
       </w:pPr>
-      <w:bookmarkStart w:id="34" w:name="_Toc229072251"/>
       <w:r>
         <w:br w:type="page"/>
       </w:r>
@@ -15026,6 +15228,7 @@
       <w:pPr>
         <w:pStyle w:val="Ttulo2"/>
       </w:pPr>
+      <w:bookmarkStart w:id="34" w:name="_Toc229165977"/>
       <w:r>
         <w:lastRenderedPageBreak/>
         <w:t>4.3 Capturas de Pantalla — Descripción de Funcionalidades</w:t>
@@ -15036,7 +15239,7 @@
       <w:pPr>
         <w:pStyle w:val="Ttulo3"/>
       </w:pPr>
-      <w:bookmarkStart w:id="35" w:name="_Toc229072252"/>
+      <w:bookmarkStart w:id="35" w:name="_Toc229165978"/>
       <w:r>
         <w:t>4.3.1 Autenticación</w:t>
       </w:r>
@@ -15205,7 +15408,7 @@
         </w:rPr>
         <w:lastRenderedPageBreak/>
         <w:drawing>
-          <wp:inline distT="0" distB="0" distL="0" distR="0" wp14:anchorId="178BC6C2" wp14:editId="0BF7076D">
+          <wp:inline distT="0" distB="0" distL="0" distR="0" wp14:anchorId="178BC6C2" wp14:editId="27A3014E">
             <wp:extent cx="2491793" cy="5400000"/>
             <wp:effectExtent l="0" t="0" r="3810" b="0"/>
             <wp:docPr id="360643835" name="Imagen 13"/>
@@ -15272,7 +15475,6 @@
           <w:color w:val="1E3A8A"/>
         </w:rPr>
       </w:pPr>
-      <w:bookmarkStart w:id="38" w:name="_Toc229072253"/>
       <w:r>
         <w:br w:type="page"/>
       </w:r>
@@ -15281,6 +15483,7 @@
       <w:pPr>
         <w:pStyle w:val="Ttulo3"/>
       </w:pPr>
+      <w:bookmarkStart w:id="38" w:name="_Toc229165979"/>
       <w:r>
         <w:lastRenderedPageBreak/>
         <w:t>4.3.2 Panel de Control (</w:t>
@@ -15315,7 +15518,7 @@
           <w:noProof/>
         </w:rPr>
         <w:drawing>
-          <wp:inline distT="0" distB="0" distL="0" distR="0" wp14:anchorId="32C93206" wp14:editId="001A4C8A">
+          <wp:inline distT="0" distB="0" distL="0" distR="0" wp14:anchorId="32C93206" wp14:editId="6F764787">
             <wp:extent cx="2490611" cy="5400000"/>
             <wp:effectExtent l="0" t="0" r="5080" b="0"/>
             <wp:docPr id="1882258242" name="Imagen 15"/>
@@ -15383,7 +15586,6 @@
           <w:color w:val="1E3A8A"/>
         </w:rPr>
       </w:pPr>
-      <w:bookmarkStart w:id="40" w:name="_Toc229072254"/>
       <w:r>
         <w:br w:type="page"/>
       </w:r>
@@ -15392,6 +15594,7 @@
       <w:pPr>
         <w:pStyle w:val="Ttulo3"/>
       </w:pPr>
+      <w:bookmarkStart w:id="40" w:name="_Toc229165980"/>
       <w:r>
         <w:lastRenderedPageBreak/>
         <w:t>4.3.3 Mercado</w:t>
@@ -15414,7 +15617,7 @@
           <w:szCs w:val="20"/>
         </w:rPr>
         <w:drawing>
-          <wp:anchor distT="0" distB="0" distL="114300" distR="114300" simplePos="0" relativeHeight="251659264" behindDoc="0" locked="0" layoutInCell="1" allowOverlap="1" wp14:anchorId="6900BE66" wp14:editId="4DA64E65">
+          <wp:anchor distT="0" distB="0" distL="114300" distR="114300" simplePos="0" relativeHeight="251659264" behindDoc="0" locked="0" layoutInCell="1" allowOverlap="1" wp14:anchorId="6900BE66" wp14:editId="00343F8A">
             <wp:simplePos x="0" y="0"/>
             <wp:positionH relativeFrom="margin">
               <wp:posOffset>2873375</wp:posOffset>
@@ -15479,7 +15682,7 @@
           <w:szCs w:val="20"/>
         </w:rPr>
         <w:drawing>
-          <wp:anchor distT="0" distB="0" distL="114300" distR="114300" simplePos="0" relativeHeight="251658240" behindDoc="0" locked="0" layoutInCell="1" allowOverlap="1" wp14:anchorId="0B7B7495" wp14:editId="5D096CF8">
+          <wp:anchor distT="0" distB="0" distL="114300" distR="114300" simplePos="0" relativeHeight="251658240" behindDoc="0" locked="0" layoutInCell="1" allowOverlap="1" wp14:anchorId="0B7B7495" wp14:editId="3D304783">
             <wp:simplePos x="0" y="0"/>
             <wp:positionH relativeFrom="margin">
               <wp:posOffset>257175</wp:posOffset>
@@ -15633,7 +15836,6 @@
           <w:color w:val="1E3A8A"/>
         </w:rPr>
       </w:pPr>
-      <w:bookmarkStart w:id="42" w:name="_Toc229072255"/>
       <w:r>
         <w:br w:type="page"/>
       </w:r>
@@ -15642,6 +15844,7 @@
       <w:pPr>
         <w:pStyle w:val="Ttulo3"/>
       </w:pPr>
+      <w:bookmarkStart w:id="42" w:name="_Toc229165981"/>
       <w:r>
         <w:lastRenderedPageBreak/>
         <w:t>4.3.4 Operaciones de Trading</w:t>
@@ -15684,7 +15887,7 @@
           <w:noProof/>
         </w:rPr>
         <w:drawing>
-          <wp:inline distT="0" distB="0" distL="0" distR="0" wp14:anchorId="09A2B609" wp14:editId="30378581">
+          <wp:inline distT="0" distB="0" distL="0" distR="0" wp14:anchorId="09A2B609" wp14:editId="3F8A717B">
             <wp:extent cx="2490612" cy="5400000"/>
             <wp:effectExtent l="0" t="0" r="5080" b="0"/>
             <wp:docPr id="1495750688" name="Imagen 20"/>
@@ -15752,7 +15955,6 @@
           <w:color w:val="1E3A8A"/>
         </w:rPr>
       </w:pPr>
-      <w:bookmarkStart w:id="44" w:name="_Toc229072256"/>
       <w:r>
         <w:br w:type="page"/>
       </w:r>
@@ -15761,6 +15963,7 @@
       <w:pPr>
         <w:pStyle w:val="Ttulo3"/>
       </w:pPr>
+      <w:bookmarkStart w:id="44" w:name="_Toc229165982"/>
       <w:r>
         <w:lastRenderedPageBreak/>
         <w:t>4.3.5 Ranking Global</w:t>
@@ -15803,7 +16006,7 @@
           <w:noProof/>
         </w:rPr>
         <w:drawing>
-          <wp:inline distT="0" distB="0" distL="0" distR="0" wp14:anchorId="67875641" wp14:editId="38585812">
+          <wp:inline distT="0" distB="0" distL="0" distR="0" wp14:anchorId="67875641" wp14:editId="14774B24">
             <wp:extent cx="2490612" cy="5400000"/>
             <wp:effectExtent l="0" t="0" r="5080" b="0"/>
             <wp:docPr id="296947464" name="Imagen 21"/>
@@ -15871,7 +16074,6 @@
           <w:color w:val="1E3A8A"/>
         </w:rPr>
       </w:pPr>
-      <w:bookmarkStart w:id="46" w:name="_Toc229072257"/>
       <w:r>
         <w:br w:type="page"/>
       </w:r>
@@ -15880,6 +16082,7 @@
       <w:pPr>
         <w:pStyle w:val="Ttulo3"/>
       </w:pPr>
+      <w:bookmarkStart w:id="46" w:name="_Toc229165983"/>
       <w:r>
         <w:lastRenderedPageBreak/>
         <w:t>4.3.6 Retos Diarios</w:t>
@@ -15930,7 +16133,7 @@
           <w:noProof/>
         </w:rPr>
         <w:drawing>
-          <wp:inline distT="0" distB="0" distL="0" distR="0" wp14:anchorId="38422CBB" wp14:editId="50647138">
+          <wp:inline distT="0" distB="0" distL="0" distR="0" wp14:anchorId="38422CBB" wp14:editId="4E04427B">
             <wp:extent cx="2490612" cy="5400000"/>
             <wp:effectExtent l="0" t="0" r="5080" b="0"/>
             <wp:docPr id="878371091" name="Imagen 23"/>
@@ -15994,7 +16197,6 @@
       <w:pPr>
         <w:pStyle w:val="Fuerte1"/>
       </w:pPr>
-      <w:bookmarkStart w:id="48" w:name="_Toc229072258"/>
     </w:p>
     <w:p>
       <w:pPr>
@@ -16005,6 +16207,7 @@
       <w:pPr>
         <w:pStyle w:val="Ttulo3"/>
       </w:pPr>
+      <w:bookmarkStart w:id="48" w:name="_Toc229165984"/>
       <w:r>
         <w:lastRenderedPageBreak/>
         <w:t>4.3.7 Sistema de Amigos</w:t>
@@ -16055,7 +16258,7 @@
           <w:noProof/>
         </w:rPr>
         <w:drawing>
-          <wp:inline distT="0" distB="0" distL="0" distR="0" wp14:anchorId="0A9D85CF" wp14:editId="7C793147">
+          <wp:inline distT="0" distB="0" distL="0" distR="0" wp14:anchorId="0A9D85CF" wp14:editId="44F38A0F">
             <wp:extent cx="2490612" cy="5400000"/>
             <wp:effectExtent l="0" t="0" r="5080" b="0"/>
             <wp:docPr id="149508418" name="Imagen 22"/>
@@ -16237,7 +16440,6 @@
           <w:color w:val="1E3A8A"/>
         </w:rPr>
       </w:pPr>
-      <w:bookmarkStart w:id="51" w:name="_Toc229072259"/>
       <w:r>
         <w:br w:type="page"/>
       </w:r>
@@ -16246,6 +16448,7 @@
       <w:pPr>
         <w:pStyle w:val="Ttulo3"/>
       </w:pPr>
+      <w:bookmarkStart w:id="51" w:name="_Toc229165985"/>
       <w:r>
         <w:lastRenderedPageBreak/>
         <w:t>4.3.8 Sistema de Ligas</w:t>
@@ -16379,7 +16582,7 @@
         </w:rPr>
         <w:lastRenderedPageBreak/>
         <w:drawing>
-          <wp:inline distT="0" distB="0" distL="0" distR="0" wp14:anchorId="4091420F" wp14:editId="23D6A4B3">
+          <wp:inline distT="0" distB="0" distL="0" distR="0" wp14:anchorId="4091420F" wp14:editId="71B4ECF6">
             <wp:extent cx="2491793" cy="5400000"/>
             <wp:effectExtent l="0" t="0" r="3810" b="0"/>
             <wp:docPr id="489812931" name="Imagen 26"/>
@@ -16447,7 +16650,6 @@
           <w:color w:val="1E3A8A"/>
         </w:rPr>
       </w:pPr>
-      <w:bookmarkStart w:id="54" w:name="_Toc229072260"/>
       <w:r>
         <w:br w:type="page"/>
       </w:r>
@@ -16456,6 +16658,7 @@
       <w:pPr>
         <w:pStyle w:val="Ttulo3"/>
       </w:pPr>
+      <w:bookmarkStart w:id="54" w:name="_Toc229165986"/>
       <w:r>
         <w:lastRenderedPageBreak/>
         <w:t>4.3.9 Perfil de Usuario</w:t>
@@ -16482,7 +16685,7 @@
           <w:noProof/>
         </w:rPr>
         <w:drawing>
-          <wp:inline distT="0" distB="0" distL="0" distR="0" wp14:anchorId="46BE3A19" wp14:editId="2362E422">
+          <wp:inline distT="0" distB="0" distL="0" distR="0" wp14:anchorId="46BE3A19" wp14:editId="406EB224">
             <wp:extent cx="2491793" cy="5400000"/>
             <wp:effectExtent l="0" t="0" r="3810" b="0"/>
             <wp:docPr id="1784580019" name="Imagen 27"/>
@@ -16551,7 +16754,7 @@
       <w:pPr>
         <w:pStyle w:val="Ttulo1"/>
       </w:pPr>
-      <w:bookmarkStart w:id="56" w:name="_Toc229072261"/>
+      <w:bookmarkStart w:id="56" w:name="_Toc229165987"/>
       <w:r>
         <w:lastRenderedPageBreak/>
         <w:t>5. Pruebas Realizadas y Validación</w:t>
@@ -16572,7 +16775,7 @@
       <w:pPr>
         <w:pStyle w:val="Ttulo2"/>
       </w:pPr>
-      <w:bookmarkStart w:id="57" w:name="_Toc229072262"/>
+      <w:bookmarkStart w:id="57" w:name="_Toc229165988"/>
       <w:r>
         <w:t>5.1 Pruebas de Autenticación</w:t>
       </w:r>
@@ -17245,9 +17448,17 @@
           <w:noProof/>
         </w:rPr>
         <w:drawing>
-          <wp:inline distT="0" distB="0" distL="0" distR="0" wp14:anchorId="54012D9E" wp14:editId="11517541">
+          <wp:anchor distT="0" distB="0" distL="114300" distR="114300" simplePos="0" relativeHeight="251661312" behindDoc="0" locked="0" layoutInCell="1" allowOverlap="1" wp14:anchorId="54012D9E" wp14:editId="12AED46A">
+            <wp:simplePos x="0" y="0"/>
+            <wp:positionH relativeFrom="column">
+              <wp:posOffset>1567815</wp:posOffset>
+            </wp:positionH>
+            <wp:positionV relativeFrom="paragraph">
+              <wp:posOffset>73025</wp:posOffset>
+            </wp:positionV>
             <wp:extent cx="2202180" cy="3126979"/>
             <wp:effectExtent l="0" t="0" r="7620" b="0"/>
+            <wp:wrapSquare wrapText="bothSides"/>
             <wp:docPr id="1662943937" name="Imagen 1"/>
             <wp:cNvGraphicFramePr>
               <a:graphicFrameLocks xmlns:a="http://schemas.openxmlformats.org/drawingml/2006/main" noChangeAspect="1"/>
@@ -17260,7 +17471,13 @@
                     <pic:cNvPicPr/>
                   </pic:nvPicPr>
                   <pic:blipFill>
-                    <a:blip r:embed="rId22"/>
+                    <a:blip r:embed="rId22">
+                      <a:extLst>
+                        <a:ext uri="{28A0092B-C50C-407E-A947-70E740481C1C}">
+                          <a14:useLocalDpi xmlns:a14="http://schemas.microsoft.com/office/drawing/2010/main" val="0"/>
+                        </a:ext>
+                      </a:extLst>
+                    </a:blip>
                     <a:stretch>
                       <a:fillRect/>
                     </a:stretch>
@@ -17277,7 +17494,7 @@
                 </pic:pic>
               </a:graphicData>
             </a:graphic>
-          </wp:inline>
+          </wp:anchor>
         </w:drawing>
       </w:r>
     </w:p>
@@ -17294,6 +17511,136 @@
         </w:rPr>
       </w:pPr>
       <w:bookmarkStart w:id="59" w:name="BM_Figura15"/>
+    </w:p>
+    <w:p>
+      <w:pPr>
+        <w:spacing w:before="60" w:after="240"/>
+        <w:jc w:val="center"/>
+        <w:rPr>
+          <w:i/>
+          <w:iCs/>
+          <w:color w:val="475569"/>
+          <w:sz w:val="20"/>
+          <w:szCs w:val="20"/>
+        </w:rPr>
+      </w:pPr>
+    </w:p>
+    <w:p>
+      <w:pPr>
+        <w:spacing w:before="60" w:after="240"/>
+        <w:jc w:val="center"/>
+        <w:rPr>
+          <w:i/>
+          <w:iCs/>
+          <w:color w:val="475569"/>
+          <w:sz w:val="20"/>
+          <w:szCs w:val="20"/>
+        </w:rPr>
+      </w:pPr>
+    </w:p>
+    <w:p>
+      <w:pPr>
+        <w:spacing w:before="60" w:after="240"/>
+        <w:jc w:val="center"/>
+        <w:rPr>
+          <w:i/>
+          <w:iCs/>
+          <w:color w:val="475569"/>
+          <w:sz w:val="20"/>
+          <w:szCs w:val="20"/>
+        </w:rPr>
+      </w:pPr>
+    </w:p>
+    <w:p>
+      <w:pPr>
+        <w:spacing w:before="60" w:after="240"/>
+        <w:jc w:val="center"/>
+        <w:rPr>
+          <w:i/>
+          <w:iCs/>
+          <w:color w:val="475569"/>
+          <w:sz w:val="20"/>
+          <w:szCs w:val="20"/>
+        </w:rPr>
+      </w:pPr>
+    </w:p>
+    <w:p>
+      <w:pPr>
+        <w:spacing w:before="60" w:after="240"/>
+        <w:jc w:val="center"/>
+        <w:rPr>
+          <w:i/>
+          <w:iCs/>
+          <w:color w:val="475569"/>
+          <w:sz w:val="20"/>
+          <w:szCs w:val="20"/>
+        </w:rPr>
+      </w:pPr>
+    </w:p>
+    <w:p>
+      <w:pPr>
+        <w:spacing w:before="60" w:after="240"/>
+        <w:jc w:val="center"/>
+        <w:rPr>
+          <w:i/>
+          <w:iCs/>
+          <w:color w:val="475569"/>
+          <w:sz w:val="20"/>
+          <w:szCs w:val="20"/>
+        </w:rPr>
+      </w:pPr>
+    </w:p>
+    <w:p>
+      <w:pPr>
+        <w:spacing w:before="60" w:after="240"/>
+        <w:jc w:val="center"/>
+        <w:rPr>
+          <w:i/>
+          <w:iCs/>
+          <w:color w:val="475569"/>
+          <w:sz w:val="20"/>
+          <w:szCs w:val="20"/>
+        </w:rPr>
+      </w:pPr>
+    </w:p>
+    <w:p>
+      <w:pPr>
+        <w:spacing w:before="60" w:after="240"/>
+        <w:jc w:val="center"/>
+        <w:rPr>
+          <w:i/>
+          <w:iCs/>
+          <w:color w:val="475569"/>
+          <w:sz w:val="20"/>
+          <w:szCs w:val="20"/>
+        </w:rPr>
+      </w:pPr>
+    </w:p>
+    <w:p>
+      <w:pPr>
+        <w:spacing w:before="60" w:after="240"/>
+        <w:jc w:val="center"/>
+        <w:rPr>
+          <w:i/>
+          <w:iCs/>
+          <w:color w:val="475569"/>
+          <w:sz w:val="20"/>
+          <w:szCs w:val="20"/>
+        </w:rPr>
+      </w:pPr>
+    </w:p>
+    <w:p>
+      <w:pPr>
+        <w:spacing w:before="60" w:after="240"/>
+        <w:jc w:val="center"/>
+        <w:rPr>
+          <w:i/>
+          <w:iCs/>
+          <w:color w:val="475569"/>
+          <w:sz w:val="20"/>
+          <w:szCs w:val="20"/>
+        </w:rPr>
+      </w:pPr>
       <w:r>
         <w:rPr>
           <w:i/>
@@ -17360,7 +17707,7 @@
       <w:pPr>
         <w:pStyle w:val="Ttulo2"/>
       </w:pPr>
-      <w:bookmarkStart w:id="60" w:name="_Toc229072263"/>
+      <w:bookmarkStart w:id="60" w:name="_Toc229165989"/>
       <w:r>
         <w:lastRenderedPageBreak/>
         <w:t>5.2 Pruebas de Trading</w:t>
@@ -17980,7 +18327,7 @@
       <w:pPr>
         <w:pStyle w:val="Ttulo2"/>
       </w:pPr>
-      <w:bookmarkStart w:id="62" w:name="_Toc229072264"/>
+      <w:bookmarkStart w:id="62" w:name="_Toc229165990"/>
       <w:r>
         <w:t>5.3 Pruebas del Sistema de Retos</w:t>
       </w:r>
@@ -18627,7 +18974,6 @@
           <w:bCs/>
         </w:rPr>
       </w:pPr>
-      <w:bookmarkStart w:id="64" w:name="_Toc229072265"/>
       <w:r>
         <w:br w:type="page"/>
       </w:r>
@@ -18636,6 +18982,7 @@
       <w:pPr>
         <w:pStyle w:val="Ttulo2"/>
       </w:pPr>
+      <w:bookmarkStart w:id="64" w:name="_Toc229165991"/>
       <w:r>
         <w:lastRenderedPageBreak/>
         <w:t>5.4 Pruebas del Sistema Social</w:t>
@@ -19568,7 +19915,7 @@
       <w:pPr>
         <w:pStyle w:val="Ttulo1"/>
       </w:pPr>
-      <w:bookmarkStart w:id="66" w:name="_Toc229072266"/>
+      <w:bookmarkStart w:id="66" w:name="_Toc229165992"/>
       <w:r>
         <w:lastRenderedPageBreak/>
         <w:t>6. Planificación del Proyecto</w:t>
@@ -20496,7 +20843,14 @@
                 <w:sz w:val="20"/>
                 <w:szCs w:val="20"/>
               </w:rPr>
-              <w:t>May – Jun 2026</w:t>
+              <w:t>May</w:t>
+            </w:r>
+            <w:r>
+              <w:rPr>
+                <w:sz w:val="20"/>
+                <w:szCs w:val="20"/>
+              </w:rPr>
+              <w:t xml:space="preserve"> 2026</w:t>
             </w:r>
           </w:p>
         </w:tc>
@@ -20541,7 +20895,7 @@
       <w:pPr>
         <w:pStyle w:val="Ttulo1"/>
       </w:pPr>
-      <w:bookmarkStart w:id="68" w:name="_Toc229072267"/>
+      <w:bookmarkStart w:id="68" w:name="_Toc229165993"/>
       <w:r>
         <w:lastRenderedPageBreak/>
         <w:t>7. Conclusiones y Mejoras Futuras</w:t>
@@ -20552,7 +20906,7 @@
       <w:pPr>
         <w:pStyle w:val="Ttulo2"/>
       </w:pPr>
-      <w:bookmarkStart w:id="69" w:name="_Toc229072268"/>
+      <w:bookmarkStart w:id="69" w:name="_Toc229165994"/>
       <w:r>
         <w:t>7.1 Objetivos Alcanzados</w:t>
       </w:r>
@@ -20670,7 +21024,7 @@
       <w:pPr>
         <w:pStyle w:val="Ttulo2"/>
       </w:pPr>
-      <w:bookmarkStart w:id="70" w:name="_Toc229072269"/>
+      <w:bookmarkStart w:id="70" w:name="_Toc229165995"/>
       <w:r>
         <w:t>7.2 Dificultades Encontradas</w:t>
       </w:r>
@@ -20789,7 +21143,7 @@
       <w:pPr>
         <w:pStyle w:val="Ttulo2"/>
       </w:pPr>
-      <w:bookmarkStart w:id="71" w:name="_Toc229072270"/>
+      <w:bookmarkStart w:id="71" w:name="_Toc229165996"/>
       <w:r>
         <w:t>7.3 Posibles Mejoras Futuras</w:t>
       </w:r>
@@ -20949,7 +21303,7 @@
           <w:lang w:val="en-GB"/>
         </w:rPr>
       </w:pPr>
-      <w:bookmarkStart w:id="72" w:name="_Toc229072271"/>
+      <w:bookmarkStart w:id="72" w:name="_Toc229165997"/>
       <w:proofErr w:type="spellStart"/>
       <w:r>
         <w:rPr>
@@ -20964,7 +21318,7 @@
     <w:p>
       <w:pPr>
         <w:spacing w:after="120" w:line="360" w:lineRule="auto"/>
-        <w:jc w:val="both"/>
+        <w:ind w:left="709" w:hanging="709"/>
         <w:rPr>
           <w:lang w:val="en-GB"/>
         </w:rPr>
@@ -20973,67 +21327,151 @@
         <w:rPr>
           <w:lang w:val="en-GB"/>
         </w:rPr>
-        <w:t>Android Developers. (2024). Jetpack Compose. Google. https://developer.android.com/jetpack/compose</w:t>
-      </w:r>
-    </w:p>
-    <w:p>
-      <w:pPr>
-        <w:spacing w:after="240"/>
+        <w:t>Android</w:t>
+      </w:r>
+      <w:r>
         <w:rPr>
           <w:lang w:val="en-GB"/>
         </w:rPr>
-      </w:pPr>
-    </w:p>
-    <w:p>
-      <w:pPr>
-        <w:spacing w:after="120" w:line="360" w:lineRule="auto"/>
-        <w:jc w:val="both"/>
+        <w:t xml:space="preserve"> </w:t>
+      </w:r>
+      <w:r>
         <w:rPr>
           <w:lang w:val="en-GB"/>
         </w:rPr>
-      </w:pPr>
-      <w:r>
+        <w:t xml:space="preserve">Developers. (2024). Jetpack Compose. Google. </w:t>
+      </w:r>
+      <w:hyperlink r:id="rId23" w:history="1">
+        <w:r>
+          <w:rPr>
+            <w:rStyle w:val="Hipervnculo"/>
+            <w:lang w:val="en-GB"/>
+          </w:rPr>
+          <w:t>https://developer.androi</w:t>
+        </w:r>
+        <w:r>
+          <w:rPr>
+            <w:rStyle w:val="Hipervnculo"/>
+            <w:lang w:val="en-GB"/>
+          </w:rPr>
+          <w:t>d</w:t>
+        </w:r>
+        <w:r>
+          <w:rPr>
+            <w:rStyle w:val="Hipervnculo"/>
+            <w:lang w:val="en-GB"/>
+          </w:rPr>
+          <w:t>.com/jetpack/compose</w:t>
+        </w:r>
+      </w:hyperlink>
+    </w:p>
+    <w:p>
+      <w:pPr>
+        <w:spacing w:after="240"/>
+        <w:ind w:left="709" w:hanging="709"/>
         <w:rPr>
           <w:lang w:val="en-GB"/>
         </w:rPr>
-        <w:t>Android Developers. (2024). Guide to app architecture. Google. https://developer.android.com/topic/architecture</w:t>
-      </w:r>
-    </w:p>
-    <w:p>
-      <w:pPr>
-        <w:spacing w:after="240"/>
+      </w:pPr>
+    </w:p>
+    <w:p>
+      <w:pPr>
+        <w:spacing w:after="120" w:line="360" w:lineRule="auto"/>
+        <w:ind w:left="709" w:hanging="709"/>
         <w:rPr>
           <w:lang w:val="en-GB"/>
         </w:rPr>
       </w:pPr>
-    </w:p>
-    <w:p>
-      <w:pPr>
-        <w:spacing w:after="120" w:line="360" w:lineRule="auto"/>
-        <w:jc w:val="both"/>
+      <w:r>
         <w:rPr>
           <w:lang w:val="en-GB"/>
         </w:rPr>
-      </w:pPr>
-      <w:r>
+        <w:t xml:space="preserve">Android Developers. (2024). Guide to app architecture. Google. </w:t>
+      </w:r>
+      <w:hyperlink r:id="rId24" w:history="1">
+        <w:r>
+          <w:rPr>
+            <w:rStyle w:val="Hipervnculo"/>
+            <w:lang w:val="en-GB"/>
+          </w:rPr>
+          <w:t>https://developer.android.com/to</w:t>
+        </w:r>
+        <w:r>
+          <w:rPr>
+            <w:rStyle w:val="Hipervnculo"/>
+            <w:lang w:val="en-GB"/>
+          </w:rPr>
+          <w:t>p</w:t>
+        </w:r>
+        <w:r>
+          <w:rPr>
+            <w:rStyle w:val="Hipervnculo"/>
+            <w:lang w:val="en-GB"/>
+          </w:rPr>
+          <w:t>ic/architecture</w:t>
+        </w:r>
+      </w:hyperlink>
+    </w:p>
+    <w:p>
+      <w:pPr>
+        <w:spacing w:after="240"/>
+        <w:ind w:left="709" w:hanging="709"/>
         <w:rPr>
           <w:lang w:val="en-GB"/>
         </w:rPr>
-        <w:t>Android Developers. (2024). Kotlin coroutines on Android. Google. https://developer.android.com/kotlin/coroutines</w:t>
-      </w:r>
-    </w:p>
-    <w:p>
-      <w:pPr>
-        <w:spacing w:after="240"/>
+      </w:pPr>
+    </w:p>
+    <w:p>
+      <w:pPr>
+        <w:spacing w:after="120" w:line="360" w:lineRule="auto"/>
+        <w:ind w:left="709" w:hanging="709"/>
         <w:rPr>
           <w:lang w:val="en-GB"/>
         </w:rPr>
       </w:pPr>
+      <w:r>
+        <w:rPr>
+          <w:lang w:val="en-GB"/>
+        </w:rPr>
+        <w:t xml:space="preserve">Android Developers. (2024). Kotlin coroutines on Android. Google. </w:t>
+      </w:r>
+      <w:hyperlink r:id="rId25" w:history="1">
+        <w:r>
+          <w:rPr>
+            <w:rStyle w:val="Hipervnculo"/>
+            <w:lang w:val="en-GB"/>
+          </w:rPr>
+          <w:t>https://developer.android.com/kotlin/</w:t>
+        </w:r>
+        <w:r>
+          <w:rPr>
+            <w:rStyle w:val="Hipervnculo"/>
+            <w:lang w:val="en-GB"/>
+          </w:rPr>
+          <w:t>c</w:t>
+        </w:r>
+        <w:r>
+          <w:rPr>
+            <w:rStyle w:val="Hipervnculo"/>
+            <w:lang w:val="en-GB"/>
+          </w:rPr>
+          <w:t>oroutines</w:t>
+        </w:r>
+      </w:hyperlink>
+    </w:p>
+    <w:p>
+      <w:pPr>
+        <w:spacing w:after="240"/>
+        <w:ind w:left="709" w:hanging="709"/>
+        <w:rPr>
+          <w:lang w:val="en-GB"/>
+        </w:rPr>
+      </w:pPr>
     </w:p>
     <w:p>
       <w:pPr>
         <w:spacing w:after="120" w:line="360" w:lineRule="auto"/>
-        <w:jc w:val="both"/>
+        <w:ind w:left="709" w:hanging="709"/>
         <w:rPr>
           <w:lang w:val="en-GB"/>
         </w:rPr>
@@ -21064,12 +21502,36 @@
         <w:rPr>
           <w:lang w:val="en-GB"/>
         </w:rPr>
-        <w:t xml:space="preserve"> API v3 documentation. https://docs.coingecko.com</w:t>
-      </w:r>
+        <w:t xml:space="preserve"> API v3 documentation. </w:t>
+      </w:r>
+      <w:hyperlink r:id="rId26" w:history="1">
+        <w:r>
+          <w:rPr>
+            <w:rStyle w:val="Hipervnculo"/>
+            <w:lang w:val="en-GB"/>
+          </w:rPr>
+          <w:t>https://docs.coingecko.</w:t>
+        </w:r>
+        <w:r>
+          <w:rPr>
+            <w:rStyle w:val="Hipervnculo"/>
+            <w:lang w:val="en-GB"/>
+          </w:rPr>
+          <w:t>c</w:t>
+        </w:r>
+        <w:r>
+          <w:rPr>
+            <w:rStyle w:val="Hipervnculo"/>
+            <w:lang w:val="en-GB"/>
+          </w:rPr>
+          <w:t>om</w:t>
+        </w:r>
+      </w:hyperlink>
     </w:p>
     <w:p>
       <w:pPr>
         <w:spacing w:after="240"/>
+        <w:ind w:left="709" w:hanging="709"/>
         <w:rPr>
           <w:lang w:val="en-GB"/>
         </w:rPr>
@@ -21078,7 +21540,7 @@
     <w:p>
       <w:pPr>
         <w:spacing w:after="120" w:line="360" w:lineRule="auto"/>
-        <w:jc w:val="both"/>
+        <w:ind w:left="709" w:hanging="709"/>
         <w:rPr>
           <w:lang w:val="en-GB"/>
         </w:rPr>
@@ -21109,12 +21571,36 @@
         <w:rPr>
           <w:lang w:val="en-GB"/>
         </w:rPr>
-        <w:t xml:space="preserve"> Stock API documentation. https://finnhub.io/docs/api</w:t>
-      </w:r>
+        <w:t xml:space="preserve"> Stock API documentation. </w:t>
+      </w:r>
+      <w:hyperlink r:id="rId27" w:history="1">
+        <w:r>
+          <w:rPr>
+            <w:rStyle w:val="Hipervnculo"/>
+            <w:lang w:val="en-GB"/>
+          </w:rPr>
+          <w:t>https://finnhu</w:t>
+        </w:r>
+        <w:r>
+          <w:rPr>
+            <w:rStyle w:val="Hipervnculo"/>
+            <w:lang w:val="en-GB"/>
+          </w:rPr>
+          <w:t>b</w:t>
+        </w:r>
+        <w:r>
+          <w:rPr>
+            <w:rStyle w:val="Hipervnculo"/>
+            <w:lang w:val="en-GB"/>
+          </w:rPr>
+          <w:t>.io/docs/api</w:t>
+        </w:r>
+      </w:hyperlink>
     </w:p>
     <w:p>
       <w:pPr>
         <w:spacing w:after="240"/>
+        <w:ind w:left="709" w:hanging="709"/>
         <w:rPr>
           <w:lang w:val="en-GB"/>
         </w:rPr>
@@ -21123,7 +21609,7 @@
     <w:p>
       <w:pPr>
         <w:spacing w:after="120" w:line="360" w:lineRule="auto"/>
-        <w:jc w:val="both"/>
+        <w:ind w:left="709" w:hanging="709"/>
         <w:rPr>
           <w:lang w:val="en-GB"/>
         </w:rPr>
@@ -21146,12 +21632,22 @@
         <w:rPr>
           <w:lang w:val="en-GB"/>
         </w:rPr>
-        <w:t xml:space="preserve"> documentation. Google. https://firebase.google.com/docs/firestore</w:t>
-      </w:r>
+        <w:t xml:space="preserve"> documentation. Google. </w:t>
+      </w:r>
+      <w:hyperlink r:id="rId28" w:history="1">
+        <w:r>
+          <w:rPr>
+            <w:rStyle w:val="Hipervnculo"/>
+            <w:lang w:val="en-GB"/>
+          </w:rPr>
+          <w:t>https://firebase.google.com/docs/firestore</w:t>
+        </w:r>
+      </w:hyperlink>
     </w:p>
     <w:p>
       <w:pPr>
         <w:spacing w:after="240"/>
+        <w:ind w:left="709" w:hanging="709"/>
         <w:rPr>
           <w:lang w:val="en-GB"/>
         </w:rPr>
@@ -21160,7 +21656,7 @@
     <w:p>
       <w:pPr>
         <w:spacing w:after="120" w:line="360" w:lineRule="auto"/>
-        <w:jc w:val="both"/>
+        <w:ind w:left="709" w:hanging="709"/>
         <w:rPr>
           <w:lang w:val="en-GB"/>
         </w:rPr>
@@ -21169,12 +21665,22 @@
         <w:rPr>
           <w:lang w:val="en-GB"/>
         </w:rPr>
-        <w:t>Firebase. (2024). Firebase Authentication documentation. Google. https://firebase.google.com/docs/auth</w:t>
-      </w:r>
+        <w:t xml:space="preserve">Firebase. (2024). Firebase Authentication documentation. Google. </w:t>
+      </w:r>
+      <w:hyperlink r:id="rId29" w:history="1">
+        <w:r>
+          <w:rPr>
+            <w:rStyle w:val="Hipervnculo"/>
+            <w:lang w:val="en-GB"/>
+          </w:rPr>
+          <w:t>https://firebase.google.com/docs/auth</w:t>
+        </w:r>
+      </w:hyperlink>
     </w:p>
     <w:p>
       <w:pPr>
         <w:spacing w:after="240"/>
+        <w:ind w:left="709" w:hanging="709"/>
         <w:rPr>
           <w:lang w:val="en-GB"/>
         </w:rPr>
@@ -21183,7 +21689,7 @@
     <w:p>
       <w:pPr>
         <w:spacing w:after="120" w:line="360" w:lineRule="auto"/>
-        <w:jc w:val="both"/>
+        <w:ind w:left="709" w:hanging="709"/>
         <w:rPr>
           <w:lang w:val="en-GB"/>
         </w:rPr>
@@ -21192,12 +21698,36 @@
         <w:rPr>
           <w:lang w:val="en-GB"/>
         </w:rPr>
-        <w:t>Google. (2024). Material Design 3. https://m3.material.io</w:t>
-      </w:r>
+        <w:t xml:space="preserve">Google. (2024). Material Design 3. </w:t>
+      </w:r>
+      <w:hyperlink r:id="rId30" w:history="1">
+        <w:r>
+          <w:rPr>
+            <w:rStyle w:val="Hipervnculo"/>
+            <w:lang w:val="en-GB"/>
+          </w:rPr>
+          <w:t>https://m3.materi</w:t>
+        </w:r>
+        <w:r>
+          <w:rPr>
+            <w:rStyle w:val="Hipervnculo"/>
+            <w:lang w:val="en-GB"/>
+          </w:rPr>
+          <w:t>a</w:t>
+        </w:r>
+        <w:r>
+          <w:rPr>
+            <w:rStyle w:val="Hipervnculo"/>
+            <w:lang w:val="en-GB"/>
+          </w:rPr>
+          <w:t>l.io</w:t>
+        </w:r>
+      </w:hyperlink>
     </w:p>
     <w:p>
       <w:pPr>
         <w:spacing w:after="240"/>
+        <w:ind w:left="709" w:hanging="709"/>
         <w:rPr>
           <w:lang w:val="en-GB"/>
         </w:rPr>
@@ -21206,7 +21736,7 @@
     <w:p>
       <w:pPr>
         <w:spacing w:after="120" w:line="360" w:lineRule="auto"/>
-        <w:jc w:val="both"/>
+        <w:ind w:left="709" w:hanging="709"/>
         <w:rPr>
           <w:lang w:val="en-GB"/>
         </w:rPr>
@@ -21215,12 +21745,36 @@
         <w:rPr>
           <w:lang w:val="en-GB"/>
         </w:rPr>
-        <w:t>JetBrains. (2024). Kotlin documentation. https://kotlinlang.org/docs/home.html</w:t>
-      </w:r>
+        <w:t xml:space="preserve">JetBrains. (2024). Kotlin documentation. </w:t>
+      </w:r>
+      <w:hyperlink r:id="rId31" w:history="1">
+        <w:r>
+          <w:rPr>
+            <w:rStyle w:val="Hipervnculo"/>
+            <w:lang w:val="en-GB"/>
+          </w:rPr>
+          <w:t>https://kotlinlang.org/docs</w:t>
+        </w:r>
+        <w:r>
+          <w:rPr>
+            <w:rStyle w:val="Hipervnculo"/>
+            <w:lang w:val="en-GB"/>
+          </w:rPr>
+          <w:t>/</w:t>
+        </w:r>
+        <w:r>
+          <w:rPr>
+            <w:rStyle w:val="Hipervnculo"/>
+            <w:lang w:val="en-GB"/>
+          </w:rPr>
+          <w:t>home.html</w:t>
+        </w:r>
+      </w:hyperlink>
     </w:p>
     <w:p>
       <w:pPr>
         <w:spacing w:after="240"/>
+        <w:ind w:left="709" w:hanging="709"/>
         <w:rPr>
           <w:lang w:val="en-GB"/>
         </w:rPr>
@@ -21229,7 +21783,7 @@
     <w:p>
       <w:pPr>
         <w:spacing w:after="120" w:line="360" w:lineRule="auto"/>
-        <w:jc w:val="both"/>
+        <w:ind w:left="709" w:hanging="709"/>
         <w:rPr>
           <w:lang w:val="en-GB"/>
         </w:rPr>
@@ -21238,14 +21792,37 @@
         <w:rPr>
           <w:lang w:val="en-GB"/>
         </w:rPr>
-        <w:t>Square. (2024). Retrofit: A type-safe HTTP client for Android and Java. https://square.github.io/retrofit</w:t>
-      </w:r>
+        <w:t xml:space="preserve">Square. (2024). Retrofit: A type-safe HTTP client for Android and Java. </w:t>
+      </w:r>
+      <w:hyperlink r:id="rId32" w:history="1">
+        <w:r>
+          <w:rPr>
+            <w:rStyle w:val="Hipervnculo"/>
+            <w:lang w:val="en-GB"/>
+          </w:rPr>
+          <w:t>https://square.githu</w:t>
+        </w:r>
+        <w:r>
+          <w:rPr>
+            <w:rStyle w:val="Hipervnculo"/>
+            <w:lang w:val="en-GB"/>
+          </w:rPr>
+          <w:t>b</w:t>
+        </w:r>
+        <w:r>
+          <w:rPr>
+            <w:rStyle w:val="Hipervnculo"/>
+            <w:lang w:val="en-GB"/>
+          </w:rPr>
+          <w:t>.io/retrofit</w:t>
+        </w:r>
+      </w:hyperlink>
     </w:p>
     <w:p>
       <w:pPr>
         <w:pStyle w:val="Ttulo1"/>
       </w:pPr>
-      <w:bookmarkStart w:id="73" w:name="_Toc229072272"/>
+      <w:bookmarkStart w:id="73" w:name="_Toc229165998"/>
       <w:r>
         <w:lastRenderedPageBreak/>
         <w:t>Anexos</w:t>
@@ -21256,7 +21833,7 @@
       <w:pPr>
         <w:pStyle w:val="Ttulo2"/>
       </w:pPr>
-      <w:bookmarkStart w:id="74" w:name="_Toc229072273"/>
+      <w:bookmarkStart w:id="74" w:name="_Toc229165999"/>
       <w:r>
         <w:t>Anexo I — Manual de Usuario</w:t>
       </w:r>
@@ -21266,7 +21843,7 @@
       <w:pPr>
         <w:pStyle w:val="Ttulo3"/>
       </w:pPr>
-      <w:bookmarkStart w:id="75" w:name="_Toc229072274"/>
+      <w:bookmarkStart w:id="75" w:name="_Toc229166000"/>
       <w:r>
         <w:t>A.1.1 Registro e inicio de sesión</w:t>
       </w:r>
@@ -21286,7 +21863,7 @@
       <w:pPr>
         <w:pStyle w:val="Ttulo3"/>
       </w:pPr>
-      <w:bookmarkStart w:id="76" w:name="_Toc229072275"/>
+      <w:bookmarkStart w:id="76" w:name="_Toc229166001"/>
       <w:r>
         <w:t>A.1.2 Operar en el mercado</w:t>
       </w:r>
@@ -21306,7 +21883,7 @@
       <w:pPr>
         <w:pStyle w:val="Ttulo3"/>
       </w:pPr>
-      <w:bookmarkStart w:id="77" w:name="_Toc229072276"/>
+      <w:bookmarkStart w:id="77" w:name="_Toc229166002"/>
       <w:r>
         <w:t>A.1.3 Sistema de retos</w:t>
       </w:r>
@@ -21326,7 +21903,7 @@
       <w:pPr>
         <w:pStyle w:val="Ttulo3"/>
       </w:pPr>
-      <w:bookmarkStart w:id="78" w:name="_Toc229072277"/>
+      <w:bookmarkStart w:id="78" w:name="_Toc229166003"/>
       <w:r>
         <w:t>A.1.4 Añadir amigos y crear ligas</w:t>
       </w:r>
@@ -21346,7 +21923,7 @@
       <w:pPr>
         <w:pStyle w:val="Ttulo2"/>
       </w:pPr>
-      <w:bookmarkStart w:id="79" w:name="_Toc229072278"/>
+      <w:bookmarkStart w:id="79" w:name="_Toc229166004"/>
       <w:r>
         <w:lastRenderedPageBreak/>
         <w:t>Anexo II — Declaración de Originalidad</w:t>
@@ -21378,58 +21955,9 @@
         <w:t>Se declara asimismo que no se ha utilizado código de terceros sin la correspondiente atribución, y que el uso de herramientas de inteligencia artificial ha sido supervisado y verificado por los autores en todo momento.</w:t>
       </w:r>
     </w:p>
-    <w:p>
-      <w:pPr>
-        <w:spacing w:after="240"/>
-      </w:pPr>
-    </w:p>
-    <w:p>
-      <w:pPr>
-        <w:spacing w:after="240"/>
-      </w:pPr>
-    </w:p>
-    <w:p>
-      <w:pPr>
-        <w:spacing w:before="480" w:after="80"/>
-      </w:pPr>
-      <w:r>
-        <w:t xml:space="preserve">Firmado en Alcalá de Henares, a _____ </w:t>
-      </w:r>
-      <w:proofErr w:type="spellStart"/>
-      <w:r>
-        <w:t>de</w:t>
-      </w:r>
-      <w:proofErr w:type="spellEnd"/>
-      <w:r>
-        <w:t xml:space="preserve"> __________ </w:t>
-      </w:r>
-      <w:proofErr w:type="spellStart"/>
-      <w:r>
-        <w:t>de</w:t>
-      </w:r>
-      <w:proofErr w:type="spellEnd"/>
-      <w:r>
-        <w:t xml:space="preserve"> 2026.</w:t>
-      </w:r>
-    </w:p>
-    <w:p>
-      <w:pPr>
-        <w:spacing w:after="480"/>
-      </w:pPr>
-    </w:p>
-    <w:p>
-      <w:r>
-        <w:rPr>
-          <w:color w:val="475569"/>
-          <w:sz w:val="22"/>
-          <w:szCs w:val="22"/>
-        </w:rPr>
-        <w:t>Guillermo Sierra Castejón                    Iván Bertolo García                    Ximena Meyzen Calderón</w:t>
-      </w:r>
-    </w:p>
     <w:sectPr>
-      <w:headerReference w:type="default" r:id="rId23"/>
-      <w:footerReference w:type="default" r:id="rId24"/>
+      <w:headerReference w:type="default" r:id="rId33"/>
+      <w:footerReference w:type="default" r:id="rId34"/>
       <w:pgSz w:w="11906" w:h="16838"/>
       <w:pgMar w:top="1417" w:right="1701" w:bottom="1701" w:left="1701" w:header="708" w:footer="708" w:gutter="0"/>
       <w:cols w:space="720"/>
@@ -22197,7 +22725,6 @@
   <w:style w:type="character" w:default="1" w:styleId="Fuentedeprrafopredeter">
     <w:name w:val="Default Paragraph Font"/>
     <w:uiPriority w:val="1"/>
-    <w:semiHidden/>
     <w:unhideWhenUsed/>
   </w:style>
   <w:style w:type="table" w:default="1" w:styleId="Tablanormal">
@@ -22350,6 +22877,30 @@
       <w:spacing w:after="100"/>
       <w:ind w:left="480"/>
     </w:pPr>
+  </w:style>
+  <w:style w:type="character" w:styleId="Mencinsinresolver">
+    <w:name w:val="Unresolved Mention"/>
+    <w:basedOn w:val="Fuentedeprrafopredeter"/>
+    <w:uiPriority w:val="99"/>
+    <w:semiHidden/>
+    <w:unhideWhenUsed/>
+    <w:rsid w:val="004B1057"/>
+    <w:rPr>
+      <w:color w:val="605E5C"/>
+      <w:shd w:val="clear" w:color="auto" w:fill="E1DFDD"/>
+    </w:rPr>
+  </w:style>
+  <w:style w:type="character" w:styleId="Hipervnculovisitado">
+    <w:name w:val="FollowedHyperlink"/>
+    <w:basedOn w:val="Fuentedeprrafopredeter"/>
+    <w:uiPriority w:val="99"/>
+    <w:semiHidden/>
+    <w:unhideWhenUsed/>
+    <w:rsid w:val="004B1057"/>
+    <w:rPr>
+      <w:color w:val="96607D" w:themeColor="followedHyperlink"/>
+      <w:u w:val="single"/>
+    </w:rPr>
   </w:style>
 </w:styles>
 </file>

</xml_diff>